<commit_message>
feat: employment fields added and integrated
</commit_message>
<xml_diff>
--- a/public/template/biodata_template.docx
+++ b/public/template/biodata_template.docx
@@ -2485,8 +2485,6 @@
               </w:rPr>
               <w:t>{employment_record}</w:t>
             </w:r>
-            <w:bookmarkStart w:id="0" w:name="_GoBack"/>
-            <w:bookmarkEnd w:id="0"/>
           </w:p>
           <w:p>
             <w:pPr>
@@ -2837,11 +2835,21 @@
             <w:pPr>
               <w:jc w:val="center"/>
               <w:rPr>
-                <w:rFonts w:ascii="STXihei" w:hAnsi="STXihei" w:eastAsia="STXihei"/>
-                <w:sz w:val="22"/>
-                <w:szCs w:val="22"/>
-              </w:rPr>
-            </w:pPr>
+                <w:rFonts w:hint="default" w:ascii="STXihei" w:hAnsi="STXihei" w:eastAsia="STXihei"/>
+                <w:sz w:val="22"/>
+                <w:szCs w:val="22"/>
+                <w:lang w:val="en-US"/>
+              </w:rPr>
+            </w:pPr>
+            <w:r>
+              <w:rPr>
+                <w:rFonts w:hint="default" w:ascii="STXihei" w:hAnsi="STXihei" w:eastAsia="STXihei"/>
+                <w:sz w:val="22"/>
+                <w:szCs w:val="22"/>
+                <w:lang w:val="en-US"/>
+              </w:rPr>
+              <w:t>{#experience}{from}</w:t>
+            </w:r>
           </w:p>
         </w:tc>
         <w:tc>
@@ -2865,11 +2873,21 @@
             <w:pPr>
               <w:jc w:val="center"/>
               <w:rPr>
-                <w:rFonts w:ascii="STXihei" w:hAnsi="STXihei" w:eastAsia="STXihei"/>
-                <w:sz w:val="22"/>
-                <w:szCs w:val="22"/>
-              </w:rPr>
-            </w:pPr>
+                <w:rFonts w:hint="default" w:ascii="STXihei" w:hAnsi="STXihei" w:eastAsia="STXihei"/>
+                <w:sz w:val="22"/>
+                <w:szCs w:val="22"/>
+                <w:lang w:val="en-US"/>
+              </w:rPr>
+            </w:pPr>
+            <w:r>
+              <w:rPr>
+                <w:rFonts w:hint="default" w:ascii="STXihei" w:hAnsi="STXihei" w:eastAsia="STXihei"/>
+                <w:sz w:val="22"/>
+                <w:szCs w:val="22"/>
+                <w:lang w:val="en-US"/>
+              </w:rPr>
+              <w:t>{to}</w:t>
+            </w:r>
           </w:p>
         </w:tc>
         <w:tc>
@@ -2893,11 +2911,21 @@
             <w:pPr>
               <w:jc w:val="center"/>
               <w:rPr>
-                <w:rFonts w:ascii="STXihei" w:hAnsi="STXihei" w:eastAsia="STXihei"/>
-                <w:sz w:val="22"/>
-                <w:szCs w:val="22"/>
-              </w:rPr>
-            </w:pPr>
+                <w:rFonts w:hint="default" w:ascii="STXihei" w:hAnsi="STXihei" w:eastAsia="STXihei"/>
+                <w:sz w:val="22"/>
+                <w:szCs w:val="22"/>
+                <w:lang w:val="en-US"/>
+              </w:rPr>
+            </w:pPr>
+            <w:r>
+              <w:rPr>
+                <w:rFonts w:hint="default" w:ascii="STXihei" w:hAnsi="STXihei" w:eastAsia="STXihei"/>
+                <w:sz w:val="22"/>
+                <w:szCs w:val="22"/>
+                <w:lang w:val="en-US"/>
+              </w:rPr>
+              <w:t>{position}</w:t>
+            </w:r>
           </w:p>
         </w:tc>
         <w:tc>
@@ -2921,11 +2949,21 @@
             <w:pPr>
               <w:jc w:val="center"/>
               <w:rPr>
-                <w:rFonts w:ascii="STXihei" w:hAnsi="STXihei" w:eastAsia="STXihei"/>
-                <w:sz w:val="22"/>
-                <w:szCs w:val="22"/>
-              </w:rPr>
-            </w:pPr>
+                <w:rFonts w:hint="default" w:ascii="STXihei" w:hAnsi="STXihei" w:eastAsia="STXihei"/>
+                <w:sz w:val="22"/>
+                <w:szCs w:val="22"/>
+                <w:lang w:val="en-US"/>
+              </w:rPr>
+            </w:pPr>
+            <w:r>
+              <w:rPr>
+                <w:rFonts w:hint="default" w:ascii="STXihei" w:hAnsi="STXihei" w:eastAsia="STXihei"/>
+                <w:sz w:val="22"/>
+                <w:szCs w:val="22"/>
+                <w:lang w:val="en-US"/>
+              </w:rPr>
+              <w:t>{name_address}</w:t>
+            </w:r>
           </w:p>
         </w:tc>
         <w:tc>
@@ -2948,11 +2986,21 @@
             <w:pPr>
               <w:jc w:val="center"/>
               <w:rPr>
-                <w:rFonts w:ascii="STXihei" w:hAnsi="STXihei" w:eastAsia="STXihei"/>
-                <w:sz w:val="22"/>
-                <w:szCs w:val="22"/>
-              </w:rPr>
-            </w:pPr>
+                <w:rFonts w:hint="default" w:ascii="STXihei" w:hAnsi="STXihei" w:eastAsia="STXihei"/>
+                <w:sz w:val="22"/>
+                <w:szCs w:val="22"/>
+                <w:lang w:val="en-US"/>
+              </w:rPr>
+            </w:pPr>
+            <w:r>
+              <w:rPr>
+                <w:rFonts w:hint="default" w:ascii="STXihei" w:hAnsi="STXihei" w:eastAsia="STXihei"/>
+                <w:sz w:val="22"/>
+                <w:szCs w:val="22"/>
+                <w:lang w:val="en-US"/>
+              </w:rPr>
+              <w:t>{reason_for_leaving}</w:t>
+            </w:r>
           </w:p>
         </w:tc>
       </w:tr>
@@ -3000,32 +3048,156 @@
               </w:tabs>
               <w:spacing w:after="200" w:line="276" w:lineRule="auto"/>
               <w:rPr>
+                <w:rFonts w:hint="eastAsia" w:ascii="STXihei" w:hAnsi="STXihei" w:eastAsia="STXihei" w:cstheme="minorBidi"/>
+                <w:b/>
+                <w:sz w:val="22"/>
+                <w:szCs w:val="22"/>
+                <w:lang w:val="en-PH" w:eastAsia="zh-CN"/>
+              </w:rPr>
+            </w:pPr>
+            <w:r>
+              <w:rPr>
                 <w:rFonts w:ascii="STXihei" w:hAnsi="STXihei" w:eastAsia="STXihei" w:cstheme="minorBidi"/>
                 <w:b/>
                 <w:sz w:val="22"/>
                 <w:szCs w:val="22"/>
                 <w:lang w:val="en-PH" w:eastAsia="zh-CN"/>
               </w:rPr>
-            </w:pPr>
-            <w:r>
-              <w:rPr>
-                <w:rFonts w:ascii="STXihei" w:hAnsi="STXihei" w:eastAsia="STXihei" w:cstheme="minorBidi"/>
+              <w:t>Job description</w:t>
+            </w:r>
+            <w:r>
+              <w:rPr>
+                <w:rFonts w:hint="eastAsia" w:ascii="STXihei" w:hAnsi="STXihei" w:eastAsia="STXihei" w:cstheme="minorBidi"/>
                 <w:b/>
                 <w:sz w:val="22"/>
                 <w:szCs w:val="22"/>
                 <w:lang w:val="en-PH" w:eastAsia="zh-CN"/>
               </w:rPr>
-              <w:t>Job description</w:t>
-            </w:r>
-            <w:r>
-              <w:rPr>
-                <w:rFonts w:hint="eastAsia" w:ascii="STXihei" w:hAnsi="STXihei" w:eastAsia="STXihei" w:cstheme="minorBidi"/>
-                <w:b/>
-                <w:sz w:val="22"/>
-                <w:szCs w:val="22"/>
-                <w:lang w:val="en-PH" w:eastAsia="zh-CN"/>
-              </w:rPr>
               <w:t>职位描述：</w:t>
+            </w:r>
+          </w:p>
+          <w:p>
+            <w:pPr>
+              <w:numPr>
+                <w:numId w:val="0"/>
+              </w:numPr>
+              <w:tabs>
+                <w:tab w:val="left" w:pos="3210"/>
+              </w:tabs>
+              <w:spacing w:after="200" w:line="276" w:lineRule="auto"/>
+              <w:ind w:leftChars="0"/>
+              <w:rPr>
+                <w:rFonts w:hint="default" w:ascii="STXihei" w:hAnsi="STXihei" w:eastAsia="STXihei" w:cstheme="minorBidi"/>
+                <w:b/>
+                <w:sz w:val="22"/>
+                <w:szCs w:val="22"/>
+                <w:lang w:val="en-US" w:eastAsia="zh-CN"/>
+              </w:rPr>
+            </w:pPr>
+            <w:r>
+              <w:rPr>
+                <w:rFonts w:hint="default" w:ascii="STXihei" w:hAnsi="STXihei" w:eastAsia="STXihei" w:cstheme="minorBidi"/>
+                <w:b/>
+                <w:sz w:val="22"/>
+                <w:szCs w:val="22"/>
+                <w:lang w:val="en-US" w:eastAsia="zh-CN"/>
+              </w:rPr>
+              <w:t xml:space="preserve">{#job_descriptions} </w:t>
+            </w:r>
+          </w:p>
+          <w:p>
+            <w:pPr>
+              <w:numPr>
+                <w:ilvl w:val="0"/>
+                <w:numId w:val="1"/>
+              </w:numPr>
+              <w:tabs>
+                <w:tab w:val="left" w:pos="3210"/>
+                <w:tab w:val="clear" w:pos="420"/>
+              </w:tabs>
+              <w:spacing w:after="200" w:line="276" w:lineRule="auto"/>
+              <w:ind w:left="420" w:leftChars="0" w:hanging="420" w:firstLineChars="0"/>
+              <w:rPr>
+                <w:rFonts w:hint="default" w:ascii="STXihei" w:hAnsi="STXihei" w:eastAsia="STXihei" w:cstheme="minorBidi"/>
+                <w:b/>
+                <w:sz w:val="22"/>
+                <w:szCs w:val="22"/>
+                <w:lang w:val="en-US" w:eastAsia="zh-CN"/>
+              </w:rPr>
+            </w:pPr>
+            <w:r>
+              <w:rPr>
+                <w:rFonts w:hint="default" w:ascii="STXihei" w:hAnsi="STXihei" w:eastAsia="STXihei" w:cstheme="minorBidi"/>
+                <w:b/>
+                <w:sz w:val="22"/>
+                <w:szCs w:val="22"/>
+                <w:lang w:val="en-US" w:eastAsia="zh-CN"/>
+              </w:rPr>
+              <w:t>{.}</w:t>
+            </w:r>
+            <w:bookmarkStart w:id="0" w:name="_GoBack"/>
+            <w:bookmarkEnd w:id="0"/>
+          </w:p>
+          <w:p>
+            <w:pPr>
+              <w:numPr>
+                <w:numId w:val="0"/>
+              </w:numPr>
+              <w:tabs>
+                <w:tab w:val="left" w:pos="3210"/>
+              </w:tabs>
+              <w:spacing w:after="200" w:line="276" w:lineRule="auto"/>
+              <w:ind w:leftChars="0"/>
+              <w:rPr>
+                <w:rFonts w:hint="default" w:ascii="STXihei" w:hAnsi="STXihei" w:eastAsia="STXihei" w:cstheme="minorBidi"/>
+                <w:b/>
+                <w:sz w:val="22"/>
+                <w:szCs w:val="22"/>
+                <w:lang w:val="en-US" w:eastAsia="zh-CN"/>
+              </w:rPr>
+            </w:pPr>
+            <w:r>
+              <w:rPr>
+                <w:rFonts w:hint="default" w:ascii="STXihei" w:hAnsi="STXihei" w:eastAsia="STXihei" w:cstheme="minorBidi"/>
+                <w:b/>
+                <w:sz w:val="22"/>
+                <w:szCs w:val="22"/>
+                <w:lang w:val="en-US" w:eastAsia="zh-CN"/>
+              </w:rPr>
+              <w:t>{/job_descriptions}</w:t>
+            </w:r>
+            <w:r>
+              <w:rPr>
+                <w:rFonts w:hint="default" w:ascii="STXihei" w:hAnsi="STXihei" w:eastAsia="STXihei" w:cstheme="minorBidi"/>
+                <w:b w:val="0"/>
+                <w:bCs/>
+                <w:sz w:val="22"/>
+                <w:szCs w:val="22"/>
+                <w:lang w:val="en-US" w:eastAsia="zh-CN"/>
+              </w:rPr>
+              <w:t>{/</w:t>
+            </w:r>
+            <w:r>
+              <w:rPr>
+                <w:rFonts w:hint="default" w:ascii="STXihei" w:hAnsi="STXihei" w:eastAsia="STXihei"/>
+                <w:b w:val="0"/>
+                <w:bCs/>
+                <w:sz w:val="22"/>
+                <w:szCs w:val="22"/>
+                <w:lang w:val="en-US"/>
+              </w:rPr>
+              <w:t>experience</w:t>
+            </w:r>
+            <w:r>
+              <w:rPr>
+                <w:rFonts w:hint="default" w:ascii="STXihei" w:hAnsi="STXihei" w:eastAsia="STXihei" w:cstheme="minorBidi"/>
+                <w:b w:val="0"/>
+                <w:bCs/>
+                <w:sz w:val="22"/>
+                <w:szCs w:val="22"/>
+                <w:lang w:val="en-US" w:eastAsia="zh-CN"/>
+              </w:rPr>
+              <w:t>}</w:t>
             </w:r>
           </w:p>
           <w:p>
@@ -4492,7 +4664,7 @@
             <w:pPr>
               <w:numPr>
                 <w:ilvl w:val="0"/>
-                <w:numId w:val="1"/>
+                <w:numId w:val="2"/>
               </w:numPr>
               <w:ind w:left="312" w:hanging="312"/>
               <w:rPr>
@@ -4518,7 +4690,7 @@
             <w:pPr>
               <w:numPr>
                 <w:ilvl w:val="0"/>
-                <w:numId w:val="1"/>
+                <w:numId w:val="2"/>
               </w:numPr>
               <w:ind w:left="312" w:hanging="312"/>
               <w:rPr>
@@ -4544,7 +4716,7 @@
             <w:pPr>
               <w:numPr>
                 <w:ilvl w:val="0"/>
-                <w:numId w:val="1"/>
+                <w:numId w:val="2"/>
               </w:numPr>
               <w:ind w:left="312" w:hanging="312"/>
               <w:rPr>
@@ -4570,7 +4742,7 @@
             <w:pPr>
               <w:numPr>
                 <w:ilvl w:val="0"/>
-                <w:numId w:val="1"/>
+                <w:numId w:val="2"/>
               </w:numPr>
               <w:ind w:left="312" w:hanging="312"/>
               <w:rPr>
@@ -4596,7 +4768,7 @@
             <w:pPr>
               <w:numPr>
                 <w:ilvl w:val="0"/>
-                <w:numId w:val="1"/>
+                <w:numId w:val="2"/>
               </w:numPr>
               <w:ind w:left="312" w:hanging="312"/>
               <w:rPr>
@@ -4622,7 +4794,7 @@
             <w:pPr>
               <w:numPr>
                 <w:ilvl w:val="0"/>
-                <w:numId w:val="1"/>
+                <w:numId w:val="2"/>
               </w:numPr>
               <w:ind w:left="312" w:hanging="312"/>
               <w:rPr>
@@ -4648,7 +4820,7 @@
             <w:pPr>
               <w:numPr>
                 <w:ilvl w:val="0"/>
-                <w:numId w:val="1"/>
+                <w:numId w:val="2"/>
               </w:numPr>
               <w:ind w:left="312" w:hanging="312"/>
               <w:rPr>
@@ -4674,7 +4846,7 @@
             <w:pPr>
               <w:numPr>
                 <w:ilvl w:val="0"/>
-                <w:numId w:val="1"/>
+                <w:numId w:val="2"/>
               </w:numPr>
               <w:ind w:left="312" w:hanging="312"/>
               <w:rPr>
@@ -4700,7 +4872,7 @@
             <w:pPr>
               <w:numPr>
                 <w:ilvl w:val="0"/>
-                <w:numId w:val="1"/>
+                <w:numId w:val="2"/>
               </w:numPr>
               <w:ind w:left="312" w:hanging="312"/>
               <w:rPr>
@@ -6740,7 +6912,30 @@
       </w:pPr>
     </w:lvl>
   </w:abstractNum>
+  <w:abstractNum w:abstractNumId="1">
+    <w:nsid w:val="2C5812F4"/>
+    <w:multiLevelType w:val="singleLevel"/>
+    <w:tmpl w:val="2C5812F4"/>
+    <w:lvl w:ilvl="0" w:tentative="0">
+      <w:start w:val="1"/>
+      <w:numFmt w:val="bullet"/>
+      <w:lvlText w:val=""/>
+      <w:lvlJc w:val="left"/>
+      <w:pPr>
+        <w:tabs>
+          <w:tab w:val="left" w:pos="420"/>
+        </w:tabs>
+        <w:ind w:left="420" w:leftChars="0" w:hanging="420" w:firstLineChars="0"/>
+      </w:pPr>
+      <w:rPr>
+        <w:rFonts w:hint="default" w:ascii="Wingdings" w:hAnsi="Wingdings"/>
+      </w:rPr>
+    </w:lvl>
+  </w:abstractNum>
   <w:num w:numId="1">
+    <w:abstractNumId w:val="1"/>
+  </w:num>
+  <w:num w:numId="2">
     <w:abstractNumId w:val="0"/>
   </w:num>
 </w:numbering>

</xml_diff>

<commit_message>
fix:fix the permanent address the biodata format. Integrated the education to biodata
</commit_message>
<xml_diff>
--- a/public/template/biodata_template.docx
+++ b/public/template/biodata_template.docx
@@ -3048,52 +3048,33 @@
               </w:tabs>
               <w:spacing w:after="200" w:line="276" w:lineRule="auto"/>
               <w:rPr>
+                <w:rFonts w:hint="default" w:ascii="STXihei" w:hAnsi="STXihei" w:eastAsia="STXihei" w:cstheme="minorBidi"/>
+                <w:b/>
+                <w:sz w:val="22"/>
+                <w:szCs w:val="22"/>
+                <w:lang w:val="en-US" w:eastAsia="zh-CN"/>
+              </w:rPr>
+            </w:pPr>
+            <w:r>
+              <w:rPr>
+                <w:rFonts w:ascii="STXihei" w:hAnsi="STXihei" w:eastAsia="STXihei" w:cstheme="minorBidi"/>
+                <w:b/>
+                <w:sz w:val="22"/>
+                <w:szCs w:val="22"/>
+                <w:lang w:val="en-PH" w:eastAsia="zh-CN"/>
+              </w:rPr>
+              <w:t>Job description</w:t>
+            </w:r>
+            <w:r>
+              <w:rPr>
                 <w:rFonts w:hint="eastAsia" w:ascii="STXihei" w:hAnsi="STXihei" w:eastAsia="STXihei" w:cstheme="minorBidi"/>
                 <w:b/>
                 <w:sz w:val="22"/>
                 <w:szCs w:val="22"/>
                 <w:lang w:val="en-PH" w:eastAsia="zh-CN"/>
               </w:rPr>
-            </w:pPr>
-            <w:r>
-              <w:rPr>
-                <w:rFonts w:ascii="STXihei" w:hAnsi="STXihei" w:eastAsia="STXihei" w:cstheme="minorBidi"/>
-                <w:b/>
-                <w:sz w:val="22"/>
-                <w:szCs w:val="22"/>
-                <w:lang w:val="en-PH" w:eastAsia="zh-CN"/>
-              </w:rPr>
-              <w:t>Job description</w:t>
-            </w:r>
-            <w:r>
-              <w:rPr>
-                <w:rFonts w:hint="eastAsia" w:ascii="STXihei" w:hAnsi="STXihei" w:eastAsia="STXihei" w:cstheme="minorBidi"/>
-                <w:b/>
-                <w:sz w:val="22"/>
-                <w:szCs w:val="22"/>
-                <w:lang w:val="en-PH" w:eastAsia="zh-CN"/>
-              </w:rPr>
               <w:t>职位描述：</w:t>
             </w:r>
-          </w:p>
-          <w:p>
-            <w:pPr>
-              <w:numPr>
-                <w:numId w:val="0"/>
-              </w:numPr>
-              <w:tabs>
-                <w:tab w:val="left" w:pos="3210"/>
-              </w:tabs>
-              <w:spacing w:after="200" w:line="276" w:lineRule="auto"/>
-              <w:ind w:leftChars="0"/>
-              <w:rPr>
-                <w:rFonts w:hint="default" w:ascii="STXihei" w:hAnsi="STXihei" w:eastAsia="STXihei" w:cstheme="minorBidi"/>
-                <w:b/>
-                <w:sz w:val="22"/>
-                <w:szCs w:val="22"/>
-                <w:lang w:val="en-US" w:eastAsia="zh-CN"/>
-              </w:rPr>
-            </w:pPr>
             <w:r>
               <w:rPr>
                 <w:rFonts w:hint="default" w:ascii="STXihei" w:hAnsi="STXihei" w:eastAsia="STXihei" w:cstheme="minorBidi"/>
@@ -3137,25 +3118,6 @@
             </w:r>
             <w:bookmarkStart w:id="0" w:name="_GoBack"/>
             <w:bookmarkEnd w:id="0"/>
-          </w:p>
-          <w:p>
-            <w:pPr>
-              <w:numPr>
-                <w:numId w:val="0"/>
-              </w:numPr>
-              <w:tabs>
-                <w:tab w:val="left" w:pos="3210"/>
-              </w:tabs>
-              <w:spacing w:after="200" w:line="276" w:lineRule="auto"/>
-              <w:ind w:leftChars="0"/>
-              <w:rPr>
-                <w:rFonts w:hint="default" w:ascii="STXihei" w:hAnsi="STXihei" w:eastAsia="STXihei" w:cstheme="minorBidi"/>
-                <w:b/>
-                <w:sz w:val="22"/>
-                <w:szCs w:val="22"/>
-                <w:lang w:val="en-US" w:eastAsia="zh-CN"/>
-              </w:rPr>
-            </w:pPr>
             <w:r>
               <w:rPr>
                 <w:rFonts w:hint="default" w:ascii="STXihei" w:hAnsi="STXihei" w:eastAsia="STXihei" w:cstheme="minorBidi"/>
@@ -4576,19 +4538,32 @@
           <w:p>
             <w:pPr>
               <w:rPr>
-                <w:sz w:val="20"/>
-                <w:szCs w:val="20"/>
-              </w:rPr>
-            </w:pPr>
-            <w:r>
-              <w:rPr>
-                <w:rFonts w:ascii="STXihei" w:hAnsi="STXihei" w:eastAsia="STXihei" w:cs="STXihei"/>
-                <w:b/>
-                <w:bCs/>
-                <w:sz w:val="20"/>
-                <w:szCs w:val="20"/>
-              </w:rPr>
-              <w:t>EDUCATIONAL ATTAINMENT 教育程度： College 大学本科</w:t>
+                <w:rFonts w:hint="default"/>
+                <w:sz w:val="20"/>
+                <w:szCs w:val="20"/>
+                <w:lang w:val="en-US"/>
+              </w:rPr>
+            </w:pPr>
+            <w:r>
+              <w:rPr>
+                <w:rFonts w:ascii="STXihei" w:hAnsi="STXihei" w:eastAsia="STXihei" w:cs="STXihei"/>
+                <w:b/>
+                <w:bCs/>
+                <w:sz w:val="20"/>
+                <w:szCs w:val="20"/>
+              </w:rPr>
+              <w:t xml:space="preserve">EDUCATIONAL ATTAINMENT 教育程度： </w:t>
+            </w:r>
+            <w:r>
+              <w:rPr>
+                <w:rFonts w:hint="default" w:ascii="STXihei" w:hAnsi="STXihei" w:eastAsia="STXihei" w:cs="STXihei"/>
+                <w:b/>
+                <w:bCs/>
+                <w:sz w:val="20"/>
+                <w:szCs w:val="20"/>
+                <w:lang w:val="en-US"/>
+              </w:rPr>
+              <w:t>{education_attainment}</w:t>
             </w:r>
           </w:p>
         </w:tc>
@@ -5253,6 +5228,27 @@
             </w:pPr>
             <w:r>
               <w:rPr>
+                <w:rFonts w:hint="default" w:ascii="STXihei" w:hAnsi="STXihei" w:eastAsia="STXihei" w:cs="STXihei"/>
+                <w:b/>
+                <w:bCs/>
+                <w:sz w:val="20"/>
+                <w:szCs w:val="20"/>
+                <w:lang w:val="en-US"/>
+              </w:rPr>
+              <w:t>{#education_records}</w:t>
+            </w:r>
+            <w:r>
+              <w:rPr>
+                <w:rFonts w:ascii="STXihei" w:hAnsi="STXihei" w:eastAsia="STXihei" w:cs="STXihei"/>
+                <w:b/>
+                <w:bCs/>
+                <w:sz w:val="20"/>
+                <w:szCs w:val="20"/>
+              </w:rPr>
+              <w:br w:type="textWrapping"/>
+            </w:r>
+            <w:r>
+              <w:rPr>
                 <w:rFonts w:ascii="STXihei" w:hAnsi="STXihei" w:eastAsia="STXihei" w:cs="STXihei"/>
                 <w:b/>
                 <w:bCs/>
@@ -5276,17 +5272,20 @@
             <w:pPr>
               <w:jc w:val="center"/>
               <w:rPr>
-                <w:sz w:val="20"/>
-                <w:szCs w:val="20"/>
-              </w:rPr>
-            </w:pPr>
-            <w:r>
-              <w:rPr>
-                <w:rFonts w:ascii="STXihei" w:hAnsi="STXihei" w:eastAsia="STXihei" w:cs="STXihei"/>
-                <w:sz w:val="20"/>
-                <w:szCs w:val="20"/>
-              </w:rPr>
-              <w:t>COLLEGE GRADUATE</w:t>
+                <w:rFonts w:hint="default" w:ascii="STXihei" w:hAnsi="STXihei" w:eastAsia="STXihei" w:cs="STXihei"/>
+                <w:sz w:val="20"/>
+                <w:szCs w:val="20"/>
+                <w:lang w:val="en-US"/>
+              </w:rPr>
+            </w:pPr>
+            <w:r>
+              <w:rPr>
+                <w:rFonts w:hint="default" w:ascii="STXihei" w:hAnsi="STXihei" w:eastAsia="STXihei" w:cs="STXihei"/>
+                <w:sz w:val="20"/>
+                <w:szCs w:val="20"/>
+                <w:lang w:val="en-US"/>
+              </w:rPr>
+              <w:t>{level}</w:t>
             </w:r>
           </w:p>
           <w:p>
@@ -5319,10 +5318,21 @@
             <w:pPr>
               <w:jc w:val="center"/>
               <w:rPr>
-                <w:sz w:val="20"/>
-                <w:szCs w:val="20"/>
-              </w:rPr>
-            </w:pPr>
+                <w:rFonts w:hint="default"/>
+                <w:sz w:val="20"/>
+                <w:szCs w:val="20"/>
+                <w:lang w:val="en-US"/>
+              </w:rPr>
+            </w:pPr>
+            <w:r>
+              <w:rPr>
+                <w:rFonts w:hint="eastAsia" w:ascii="STXihei" w:hAnsi="STXihei" w:eastAsia="STXihei" w:cs="STXihei"/>
+                <w:sz w:val="20"/>
+                <w:szCs w:val="20"/>
+                <w:lang w:val="en-US"/>
+              </w:rPr>
+              <w:t>{school}</w:t>
+            </w:r>
           </w:p>
         </w:tc>
         <w:tc>
@@ -5345,10 +5355,21 @@
             <w:pPr>
               <w:jc w:val="center"/>
               <w:rPr>
-                <w:sz w:val="20"/>
-                <w:szCs w:val="20"/>
-              </w:rPr>
-            </w:pPr>
+                <w:rFonts w:hint="default"/>
+                <w:sz w:val="20"/>
+                <w:szCs w:val="20"/>
+                <w:lang w:val="en-US"/>
+              </w:rPr>
+            </w:pPr>
+            <w:r>
+              <w:rPr>
+                <w:rFonts w:hint="eastAsia" w:ascii="STXihei" w:hAnsi="STXihei" w:eastAsia="STXihei" w:cs="STXihei"/>
+                <w:sz w:val="20"/>
+                <w:szCs w:val="20"/>
+                <w:lang w:val="en-US"/>
+              </w:rPr>
+              <w:t>{from}</w:t>
+            </w:r>
           </w:p>
         </w:tc>
         <w:tc>
@@ -5372,10 +5393,21 @@
             <w:pPr>
               <w:jc w:val="center"/>
               <w:rPr>
-                <w:sz w:val="20"/>
-                <w:szCs w:val="20"/>
-              </w:rPr>
-            </w:pPr>
+                <w:rFonts w:hint="default"/>
+                <w:sz w:val="20"/>
+                <w:szCs w:val="20"/>
+                <w:lang w:val="en-US"/>
+              </w:rPr>
+            </w:pPr>
+            <w:r>
+              <w:rPr>
+                <w:rFonts w:hint="eastAsia" w:ascii="STXihei" w:hAnsi="STXihei" w:eastAsia="STXihei" w:cs="STXihei"/>
+                <w:sz w:val="20"/>
+                <w:szCs w:val="20"/>
+                <w:lang w:val="en-US"/>
+              </w:rPr>
+              <w:t>{to}</w:t>
+            </w:r>
           </w:p>
         </w:tc>
         <w:tc>
@@ -5398,10 +5430,30 @@
             <w:pPr>
               <w:jc w:val="center"/>
               <w:rPr>
-                <w:sz w:val="20"/>
-                <w:szCs w:val="20"/>
-              </w:rPr>
-            </w:pPr>
+                <w:rFonts w:hint="default"/>
+                <w:sz w:val="20"/>
+                <w:szCs w:val="20"/>
+                <w:lang w:val="en-US"/>
+              </w:rPr>
+            </w:pPr>
+            <w:r>
+              <w:rPr>
+                <w:rFonts w:hint="eastAsia" w:ascii="STXihei" w:hAnsi="STXihei" w:eastAsia="STXihei" w:cs="STXihei"/>
+                <w:sz w:val="20"/>
+                <w:szCs w:val="20"/>
+                <w:lang w:val="en-US"/>
+              </w:rPr>
+              <w:t>{major_course}</w:t>
+            </w:r>
+            <w:r>
+              <w:rPr>
+                <w:rFonts w:hint="default"/>
+                <w:sz w:val="20"/>
+                <w:szCs w:val="20"/>
+                <w:lang w:val="en-US"/>
+              </w:rPr>
+              <w:t>{/education_records}</w:t>
+            </w:r>
           </w:p>
         </w:tc>
         <w:tc>

</xml_diff>

<commit_message>
integraded the password to biodata but not tested yet
</commit_message>
<xml_diff>
--- a/public/template/biodata_template.docx
+++ b/public/template/biodata_template.docx
@@ -3114,19 +3114,7 @@
                 <w:szCs w:val="22"/>
                 <w:lang w:val="en-US" w:eastAsia="zh-CN"/>
               </w:rPr>
-              <w:t>{.}</w:t>
-            </w:r>
-            <w:bookmarkStart w:id="0" w:name="_GoBack"/>
-            <w:bookmarkEnd w:id="0"/>
-            <w:r>
-              <w:rPr>
-                <w:rFonts w:hint="default" w:ascii="STXihei" w:hAnsi="STXihei" w:eastAsia="STXihei" w:cstheme="minorBidi"/>
-                <w:b/>
-                <w:sz w:val="22"/>
-                <w:szCs w:val="22"/>
-                <w:lang w:val="en-US" w:eastAsia="zh-CN"/>
-              </w:rPr>
-              <w:t>{/job_descriptions}</w:t>
+              <w:t>{.}{/job_descriptions}</w:t>
             </w:r>
             <w:r>
               <w:rPr>
@@ -5599,11 +5587,45 @@
           <w:p>
             <w:pPr>
               <w:rPr>
-                <w:bCs/>
-                <w:sz w:val="20"/>
-                <w:szCs w:val="20"/>
-              </w:rPr>
-            </w:pPr>
+                <w:rFonts w:hint="default"/>
+                <w:bCs/>
+                <w:sz w:val="20"/>
+                <w:szCs w:val="20"/>
+                <w:lang w:val="en-US"/>
+              </w:rPr>
+            </w:pPr>
+            <w:r>
+              <w:rPr>
+                <w:rFonts w:hint="eastAsia" w:ascii="STXihei" w:hAnsi="STXihei" w:eastAsia="STXihei" w:cs="STXihei"/>
+                <w:bCs/>
+                <w:sz w:val="20"/>
+                <w:szCs w:val="20"/>
+                <w:lang w:val="en-US"/>
+              </w:rPr>
+              <w:t>{</w:t>
+            </w:r>
+            <w:r>
+              <w:rPr>
+                <w:rFonts w:hint="default" w:ascii="STXihei" w:hAnsi="STXihei" w:eastAsia="STXihei" w:cs="STXihei"/>
+                <w:bCs/>
+                <w:sz w:val="20"/>
+                <w:szCs w:val="20"/>
+                <w:lang w:val="en-US"/>
+              </w:rPr>
+              <w:t>p</w:t>
+            </w:r>
+            <w:r>
+              <w:rPr>
+                <w:rFonts w:hint="eastAsia" w:ascii="STXihei" w:hAnsi="STXihei" w:eastAsia="STXihei" w:cs="STXihei"/>
+                <w:bCs/>
+                <w:sz w:val="20"/>
+                <w:szCs w:val="20"/>
+                <w:lang w:val="en-US"/>
+              </w:rPr>
+              <w:t>assport_no}</w:t>
+            </w:r>
+            <w:bookmarkStart w:id="0" w:name="_GoBack"/>
+            <w:bookmarkEnd w:id="0"/>
           </w:p>
         </w:tc>
         <w:tc>
@@ -5698,7 +5720,91 @@
                 <w:sz w:val="20"/>
                 <w:szCs w:val="20"/>
               </w:rPr>
-              <w:t xml:space="preserve">From自                                                       To至   </w:t>
+              <w:t>From自</w:t>
+            </w:r>
+            <w:r>
+              <w:rPr>
+                <w:rFonts w:hint="default" w:ascii="STXihei" w:hAnsi="STXihei" w:eastAsia="STXihei" w:cs="STXihei"/>
+                <w:b/>
+                <w:bCs/>
+                <w:sz w:val="20"/>
+                <w:szCs w:val="20"/>
+                <w:lang w:val="en-US"/>
+              </w:rPr>
+              <w:t xml:space="preserve"> </w:t>
+            </w:r>
+            <w:r>
+              <w:rPr>
+                <w:rFonts w:hint="default" w:ascii="STXihei" w:hAnsi="STXihei" w:eastAsia="STXihei" w:cs="STXihei"/>
+                <w:b w:val="0"/>
+                <w:bCs w:val="0"/>
+                <w:sz w:val="20"/>
+                <w:szCs w:val="20"/>
+                <w:lang w:val="en-US"/>
+              </w:rPr>
+              <w:t>{</w:t>
+            </w:r>
+            <w:r>
+              <w:rPr>
+                <w:rFonts w:hint="default" w:ascii="STXihei" w:hAnsi="STXihei" w:eastAsia="STXihei" w:cs="STXihei"/>
+                <w:b w:val="0"/>
+                <w:bCs w:val="0"/>
+                <w:sz w:val="20"/>
+                <w:szCs w:val="20"/>
+                <w:lang w:val="en-US"/>
+              </w:rPr>
+              <w:t>passport_valid_from}</w:t>
+            </w:r>
+            <w:r>
+              <w:rPr>
+                <w:rFonts w:ascii="STXihei" w:hAnsi="STXihei" w:eastAsia="STXihei" w:cs="STXihei"/>
+                <w:b w:val="0"/>
+                <w:bCs w:val="0"/>
+                <w:sz w:val="20"/>
+                <w:szCs w:val="20"/>
+              </w:rPr>
+              <w:t xml:space="preserve">  </w:t>
+            </w:r>
+            <w:r>
+              <w:rPr>
+                <w:rFonts w:ascii="STXihei" w:hAnsi="STXihei" w:eastAsia="STXihei" w:cs="STXihei"/>
+                <w:b/>
+                <w:bCs/>
+                <w:sz w:val="20"/>
+                <w:szCs w:val="20"/>
+              </w:rPr>
+              <w:t xml:space="preserve">                To至 </w:t>
+            </w:r>
+            <w:r>
+              <w:rPr>
+                <w:rFonts w:hint="default" w:ascii="STXihei" w:hAnsi="STXihei" w:eastAsia="STXihei" w:cs="STXihei"/>
+                <w:b w:val="0"/>
+                <w:bCs w:val="0"/>
+                <w:sz w:val="20"/>
+                <w:szCs w:val="20"/>
+                <w:lang w:val="en-US"/>
+              </w:rPr>
+              <w:t>{passport_valid_to}</w:t>
+            </w:r>
+            <w:r>
+              <w:rPr>
+                <w:rFonts w:ascii="STXihei" w:hAnsi="STXihei" w:eastAsia="STXihei" w:cs="STXihei"/>
+                <w:b w:val="0"/>
+                <w:bCs w:val="0"/>
+                <w:sz w:val="20"/>
+                <w:szCs w:val="20"/>
+              </w:rPr>
+              <w:t xml:space="preserve"> </w:t>
+            </w:r>
+            <w:r>
+              <w:rPr>
+                <w:rFonts w:ascii="STXihei" w:hAnsi="STXihei" w:eastAsia="STXihei" w:cs="STXihei"/>
+                <w:b/>
+                <w:bCs/>
+                <w:sz w:val="20"/>
+                <w:szCs w:val="20"/>
+              </w:rPr>
+              <w:t xml:space="preserve"> </w:t>
             </w:r>
           </w:p>
         </w:tc>

</xml_diff>

<commit_message>
feat: wrote the pattern for skill and languages in the docx but not tested
</commit_message>
<xml_diff>
--- a/public/template/biodata_template.docx
+++ b/public/template/biodata_template.docx
@@ -5624,8 +5624,6 @@
               </w:rPr>
               <w:t>assport_no}</w:t>
             </w:r>
-            <w:bookmarkStart w:id="0" w:name="_GoBack"/>
-            <w:bookmarkEnd w:id="0"/>
           </w:p>
         </w:tc>
         <w:tc>
@@ -5900,11 +5898,36 @@
                 <w:sz w:val="20"/>
                 <w:szCs w:val="20"/>
               </w:rPr>
-              <w:t>English英文     speak说:  Fluent 流利 □      Ordinary普通</w:t>
+              <w:t xml:space="preserve">English英文     speak说:  Fluent 流利 </w:t>
             </w:r>
             <w:r>
               <w:rPr>
                 <w:rFonts w:hint="eastAsia" w:ascii="STXihei" w:hAnsi="STXihei" w:eastAsia="STXihei" w:cs="STXihei"/>
+                <w:sz w:val="20"/>
+                <w:szCs w:val="20"/>
+              </w:rPr>
+              <w:t>{#is_english_fluent}■{/is_english_fluent}{</w:t>
+            </w:r>
+            <w:r>
+              <w:rPr>
+                <w:rFonts w:hint="default" w:ascii="STXihei" w:hAnsi="STXihei" w:eastAsia="STXihei" w:cs="STXihei"/>
+                <w:sz w:val="20"/>
+                <w:szCs w:val="20"/>
+                <w:lang w:val="en-US"/>
+              </w:rPr>
+              <w:t>^</w:t>
+            </w:r>
+            <w:r>
+              <w:rPr>
+                <w:rFonts w:hint="eastAsia" w:ascii="STXihei" w:hAnsi="STXihei" w:eastAsia="STXihei" w:cs="STXihei"/>
+                <w:sz w:val="20"/>
+                <w:szCs w:val="20"/>
+              </w:rPr>
+              <w:t>is_english_fluent}□{/is_english_fluent}</w:t>
+            </w:r>
+            <w:r>
+              <w:rPr>
+                <w:rFonts w:hint="eastAsia" w:ascii="STXihei" w:hAnsi="STXihei" w:eastAsia="STXihei" w:cs="STXihei"/>
                 <w:b/>
                 <w:bCs/>
                 <w:sz w:val="20"/>
@@ -5914,22 +5937,93 @@
             </w:r>
             <w:r>
               <w:rPr>
-                <w:b/>
-                <w:bCs/>
-                <w:sz w:val="20"/>
-                <w:szCs w:val="20"/>
-              </w:rPr>
-              <w:t>■</w:t>
-            </w:r>
-            <w:r>
-              <w:rPr>
-                <w:rFonts w:ascii="STXihei" w:hAnsi="STXihei" w:eastAsia="STXihei" w:cs="STXihei"/>
-                <w:b/>
-                <w:bCs/>
-                <w:sz w:val="20"/>
-                <w:szCs w:val="20"/>
-              </w:rPr>
-              <w:t xml:space="preserve">    Difference 差 □ </w:t>
+                <w:rFonts w:ascii="STXihei" w:hAnsi="STXihei" w:eastAsia="STXihei" w:cs="STXihei"/>
+                <w:b/>
+                <w:bCs/>
+                <w:sz w:val="20"/>
+                <w:szCs w:val="20"/>
+              </w:rPr>
+              <w:t xml:space="preserve">    Ordinary普通</w:t>
+            </w:r>
+            <w:r>
+              <w:rPr>
+                <w:rFonts w:hint="eastAsia" w:ascii="STXihei" w:hAnsi="STXihei" w:eastAsia="STXihei" w:cs="STXihei"/>
+                <w:b/>
+                <w:bCs/>
+                <w:sz w:val="20"/>
+                <w:szCs w:val="20"/>
+              </w:rPr>
+              <w:t xml:space="preserve"> </w:t>
+            </w:r>
+            <w:r>
+              <w:rPr>
+                <w:rFonts w:hint="eastAsia" w:ascii="STXihei" w:hAnsi="STXihei" w:eastAsia="STXihei" w:cs="STXihei"/>
+                <w:sz w:val="20"/>
+                <w:szCs w:val="20"/>
+              </w:rPr>
+              <w:t>{#is_english_ordinary}■{/is_english_ordinary}{</w:t>
+            </w:r>
+            <w:r>
+              <w:rPr>
+                <w:rFonts w:hint="default" w:ascii="STXihei" w:hAnsi="STXihei" w:eastAsia="STXihei" w:cs="STXihei"/>
+                <w:sz w:val="20"/>
+                <w:szCs w:val="20"/>
+                <w:lang w:val="en-US"/>
+              </w:rPr>
+              <w:t>^</w:t>
+            </w:r>
+            <w:r>
+              <w:rPr>
+                <w:rFonts w:hint="eastAsia" w:ascii="STXihei" w:hAnsi="STXihei" w:eastAsia="STXihei" w:cs="STXihei"/>
+                <w:sz w:val="20"/>
+                <w:szCs w:val="20"/>
+              </w:rPr>
+              <w:t>is_english_ordinary}□{/is_english_ordinary}</w:t>
+            </w:r>
+            <w:r>
+              <w:rPr>
+                <w:rFonts w:hint="eastAsia" w:ascii="STXihei" w:hAnsi="STXihei" w:eastAsia="STXihei" w:cs="STXihei"/>
+                <w:b/>
+                <w:bCs/>
+                <w:sz w:val="20"/>
+                <w:szCs w:val="20"/>
+              </w:rPr>
+              <w:t xml:space="preserve"> </w:t>
+            </w:r>
+            <w:r>
+              <w:rPr>
+                <w:rFonts w:ascii="STXihei" w:hAnsi="STXihei" w:eastAsia="STXihei" w:cs="STXihei"/>
+                <w:b/>
+                <w:bCs/>
+                <w:sz w:val="20"/>
+                <w:szCs w:val="20"/>
+              </w:rPr>
+              <w:t xml:space="preserve">  Difference 差 </w:t>
+            </w:r>
+            <w:r>
+              <w:rPr>
+                <w:rFonts w:hint="eastAsia" w:ascii="STXihei" w:hAnsi="STXihei" w:eastAsia="STXihei" w:cs="STXihei"/>
+                <w:sz w:val="20"/>
+                <w:szCs w:val="20"/>
+              </w:rPr>
+              <w:t>{#is_english_difference}■{/is_english_difference}{</w:t>
+            </w:r>
+            <w:r>
+              <w:rPr>
+                <w:rFonts w:hint="default" w:ascii="STXihei" w:hAnsi="STXihei" w:eastAsia="STXihei" w:cs="STXihei"/>
+                <w:sz w:val="20"/>
+                <w:szCs w:val="20"/>
+                <w:lang w:val="en-US"/>
+              </w:rPr>
+              <w:t>^</w:t>
+            </w:r>
+            <w:r>
+              <w:rPr>
+                <w:rFonts w:hint="eastAsia" w:ascii="STXihei" w:hAnsi="STXihei" w:eastAsia="STXihei" w:cs="STXihei"/>
+                <w:sz w:val="20"/>
+                <w:szCs w:val="20"/>
+              </w:rPr>
+              <w:t>is_english_difference}□{/is_english_difference}</w:t>
             </w:r>
           </w:p>
           <w:p>
@@ -5961,17 +6055,32 @@
             </w:r>
             <w:r>
               <w:rPr>
-                <w:rFonts w:ascii="STXihei" w:hAnsi="STXihei" w:eastAsia="STXihei" w:cs="STXihei"/>
-                <w:b/>
-                <w:bCs/>
-                <w:sz w:val="20"/>
-                <w:szCs w:val="20"/>
-              </w:rPr>
-              <w:t xml:space="preserve">□ </w:t>
-            </w:r>
-            <w:r>
-              <w:rPr>
-                <w:rFonts w:ascii="STXihei" w:hAnsi="STXihei" w:eastAsia="STXihei" w:cs="STXihei"/>
+                <w:rFonts w:hint="eastAsia" w:ascii="STXihei" w:hAnsi="STXihei" w:eastAsia="STXihei" w:cs="STXihei"/>
+                <w:sz w:val="20"/>
+                <w:szCs w:val="20"/>
+              </w:rPr>
+              <w:t>#is_english_write_fluent}■{/is_english_write_fluent}{</w:t>
+            </w:r>
+            <w:r>
+              <w:rPr>
+                <w:rFonts w:hint="default" w:ascii="STXihei" w:hAnsi="STXihei" w:eastAsia="STXihei" w:cs="STXihei"/>
+                <w:sz w:val="20"/>
+                <w:szCs w:val="20"/>
+                <w:lang w:val="en-US"/>
+              </w:rPr>
+              <w:t>^</w:t>
+            </w:r>
+            <w:r>
+              <w:rPr>
+                <w:rFonts w:hint="eastAsia" w:ascii="STXihei" w:hAnsi="STXihei" w:eastAsia="STXihei" w:cs="STXihei"/>
+                <w:sz w:val="20"/>
+                <w:szCs w:val="20"/>
+              </w:rPr>
+              <w:t>is_english_write_fluent}□{/is_english_write_fluent}</w:t>
+            </w:r>
+            <w:r>
+              <w:rPr>
+                <w:rFonts w:hint="eastAsia" w:ascii="STXihei" w:hAnsi="STXihei" w:eastAsia="STXihei" w:cs="STXihei"/>
                 <w:color w:val="202124"/>
                 <w:sz w:val="20"/>
                 <w:szCs w:val="20"/>
@@ -5991,22 +6100,83 @@
             </w:r>
             <w:r>
               <w:rPr>
-                <w:b/>
-                <w:bCs/>
-                <w:sz w:val="20"/>
-                <w:szCs w:val="20"/>
-              </w:rPr>
-              <w:t>■</w:t>
-            </w:r>
-            <w:r>
-              <w:rPr>
-                <w:rFonts w:ascii="STXihei" w:hAnsi="STXihei" w:eastAsia="STXihei" w:cs="STXihei"/>
-                <w:b/>
-                <w:bCs/>
-                <w:sz w:val="20"/>
-                <w:szCs w:val="20"/>
-              </w:rPr>
-              <w:t xml:space="preserve">     Difference 差 □  </w:t>
+                <w:rFonts w:hint="eastAsia" w:ascii="STXihei" w:hAnsi="STXihei" w:eastAsia="STXihei" w:cs="STXihei"/>
+                <w:sz w:val="20"/>
+                <w:szCs w:val="20"/>
+              </w:rPr>
+              <w:t>{#is_english_write_ordinary}■{/is_english_write_ordinary}{</w:t>
+            </w:r>
+            <w:r>
+              <w:rPr>
+                <w:rFonts w:hint="default" w:ascii="STXihei" w:hAnsi="STXihei" w:eastAsia="STXihei" w:cs="STXihei"/>
+                <w:sz w:val="20"/>
+                <w:szCs w:val="20"/>
+                <w:lang w:val="en-US"/>
+              </w:rPr>
+              <w:t>^</w:t>
+            </w:r>
+            <w:r>
+              <w:rPr>
+                <w:rFonts w:hint="eastAsia" w:ascii="STXihei" w:hAnsi="STXihei" w:eastAsia="STXihei" w:cs="STXihei"/>
+                <w:sz w:val="20"/>
+                <w:szCs w:val="20"/>
+              </w:rPr>
+              <w:t>is_english_write_ordinary}□{/is_english_write_ordinary}</w:t>
+            </w:r>
+            <w:r>
+              <w:rPr>
+                <w:rFonts w:hint="eastAsia" w:ascii="STXihei" w:hAnsi="STXihei" w:eastAsia="STXihei" w:cs="STXihei"/>
+                <w:b/>
+                <w:bCs/>
+                <w:sz w:val="20"/>
+                <w:szCs w:val="20"/>
+              </w:rPr>
+              <w:t xml:space="preserve">   </w:t>
+            </w:r>
+            <w:r>
+              <w:rPr>
+                <w:rFonts w:ascii="STXihei" w:hAnsi="STXihei" w:eastAsia="STXihei" w:cs="STXihei"/>
+                <w:b/>
+                <w:bCs/>
+                <w:sz w:val="20"/>
+                <w:szCs w:val="20"/>
+              </w:rPr>
+              <w:t xml:space="preserve">  Difference 差 </w:t>
+            </w:r>
+            <w:r>
+              <w:rPr>
+                <w:rFonts w:hint="eastAsia" w:ascii="STXihei" w:hAnsi="STXihei" w:eastAsia="STXihei" w:cs="STXihei"/>
+                <w:sz w:val="20"/>
+                <w:szCs w:val="20"/>
+              </w:rPr>
+              <w:t>{#is_english_write_difference}■{/is_english_write_difference}{</w:t>
+            </w:r>
+            <w:r>
+              <w:rPr>
+                <w:rFonts w:hint="default" w:ascii="STXihei" w:hAnsi="STXihei" w:eastAsia="STXihei" w:cs="STXihei"/>
+                <w:sz w:val="20"/>
+                <w:szCs w:val="20"/>
+                <w:lang w:val="en-US"/>
+              </w:rPr>
+              <w:t>^</w:t>
+            </w:r>
+            <w:r>
+              <w:rPr>
+                <w:rFonts w:hint="eastAsia" w:ascii="STXihei" w:hAnsi="STXihei" w:eastAsia="STXihei" w:cs="STXihei"/>
+                <w:sz w:val="20"/>
+                <w:szCs w:val="20"/>
+              </w:rPr>
+              <w:t>is_english_write_difference}□{/is_english_write_difference}</w:t>
+            </w:r>
+            <w:r>
+              <w:rPr>
+                <w:rFonts w:ascii="STXihei" w:hAnsi="STXihei" w:eastAsia="STXihei" w:cs="STXihei"/>
+                <w:b/>
+                <w:bCs/>
+                <w:sz w:val="20"/>
+                <w:szCs w:val="20"/>
+              </w:rPr>
+              <w:t xml:space="preserve">  </w:t>
             </w:r>
           </w:p>
           <w:p>
@@ -6055,11 +6225,89 @@
                 <w:sz w:val="20"/>
                 <w:szCs w:val="20"/>
               </w:rPr>
-              <w:t xml:space="preserve"> □   Ordinary 普通 □   Difference 差</w:t>
+              <w:t xml:space="preserve"> </w:t>
             </w:r>
             <w:r>
               <w:rPr>
                 <w:rFonts w:hint="eastAsia" w:ascii="STXihei" w:hAnsi="STXihei" w:eastAsia="STXihei" w:cs="STXihei"/>
+                <w:sz w:val="20"/>
+                <w:szCs w:val="20"/>
+              </w:rPr>
+              <w:t>{#is_chinese_fluent}■{/is_chinese_fluent}{</w:t>
+            </w:r>
+            <w:r>
+              <w:rPr>
+                <w:rFonts w:hint="default" w:ascii="STXihei" w:hAnsi="STXihei" w:eastAsia="STXihei" w:cs="STXihei"/>
+                <w:sz w:val="20"/>
+                <w:szCs w:val="20"/>
+                <w:lang w:val="en-US"/>
+              </w:rPr>
+              <w:t>^</w:t>
+            </w:r>
+            <w:r>
+              <w:rPr>
+                <w:rFonts w:hint="eastAsia" w:ascii="STXihei" w:hAnsi="STXihei" w:eastAsia="STXihei" w:cs="STXihei"/>
+                <w:sz w:val="20"/>
+                <w:szCs w:val="20"/>
+              </w:rPr>
+              <w:t>is_chinese_fluent}□{/is_chinese_fluent</w:t>
+            </w:r>
+            <w:r>
+              <w:rPr>
+                <w:rFonts w:ascii="SimSun" w:hAnsi="SimSun" w:eastAsia="SimSun" w:cs="SimSun"/>
+                <w:sz w:val="24"/>
+                <w:szCs w:val="24"/>
+              </w:rPr>
+              <w:t>}</w:t>
+            </w:r>
+            <w:r>
+              <w:rPr>
+                <w:rFonts w:ascii="STXihei" w:hAnsi="STXihei" w:eastAsia="STXihei" w:cs="STXihei"/>
+                <w:b/>
+                <w:bCs/>
+                <w:sz w:val="20"/>
+                <w:szCs w:val="20"/>
+              </w:rPr>
+              <w:t xml:space="preserve">  Ordinary 普通 </w:t>
+            </w:r>
+            <w:r>
+              <w:rPr>
+                <w:rFonts w:hint="eastAsia" w:ascii="STXihei" w:hAnsi="STXihei" w:eastAsia="STXihei" w:cs="STXihei"/>
+                <w:sz w:val="20"/>
+                <w:szCs w:val="20"/>
+              </w:rPr>
+              <w:t>{#is_chinese_ordinary}■{/is_chinese_ordinary}{</w:t>
+            </w:r>
+            <w:r>
+              <w:rPr>
+                <w:rFonts w:hint="default" w:ascii="STXihei" w:hAnsi="STXihei" w:eastAsia="STXihei" w:cs="STXihei"/>
+                <w:sz w:val="20"/>
+                <w:szCs w:val="20"/>
+                <w:lang w:val="en-US"/>
+              </w:rPr>
+              <w:t>^</w:t>
+            </w:r>
+            <w:r>
+              <w:rPr>
+                <w:rFonts w:hint="eastAsia" w:ascii="STXihei" w:hAnsi="STXihei" w:eastAsia="STXihei" w:cs="STXihei"/>
+                <w:sz w:val="20"/>
+                <w:szCs w:val="20"/>
+              </w:rPr>
+              <w:t>is_chinese_ordinary}□{/is_chinese_ordinary}</w:t>
+            </w:r>
+            <w:r>
+              <w:rPr>
+                <w:rFonts w:ascii="STXihei" w:hAnsi="STXihei" w:eastAsia="STXihei" w:cs="STXihei"/>
+                <w:b/>
+                <w:bCs/>
+                <w:sz w:val="20"/>
+                <w:szCs w:val="20"/>
+              </w:rPr>
+              <w:t xml:space="preserve">   Difference 差</w:t>
+            </w:r>
+            <w:r>
+              <w:rPr>
+                <w:rFonts w:hint="eastAsia" w:ascii="STXihei" w:hAnsi="STXihei" w:eastAsia="STXihei" w:cs="STXihei"/>
                 <w:b/>
                 <w:bCs/>
                 <w:sz w:val="20"/>
@@ -6075,29 +6323,36 @@
                 <w:sz w:val="20"/>
                 <w:szCs w:val="20"/>
               </w:rPr>
-              <w:t xml:space="preserve">  □   </w:t>
-            </w:r>
-          </w:p>
-          <w:p>
-            <w:pPr>
-              <w:rPr>
-                <w:sz w:val="20"/>
-                <w:szCs w:val="20"/>
-              </w:rPr>
-            </w:pPr>
-            <w:r>
-              <w:rPr>
-                <w:rFonts w:ascii="STXihei" w:hAnsi="STXihei" w:eastAsia="STXihei" w:cs="STXihei"/>
-                <w:b/>
-                <w:bCs/>
-                <w:sz w:val="20"/>
-                <w:szCs w:val="20"/>
-              </w:rPr>
-              <w:t xml:space="preserve">                            Write写：Fluent 流利 □   Ordinary 普通  □   Difference 差</w:t>
+              <w:t xml:space="preserve">  </w:t>
             </w:r>
             <w:r>
               <w:rPr>
                 <w:rFonts w:hint="eastAsia" w:ascii="STXihei" w:hAnsi="STXihei" w:eastAsia="STXihei" w:cs="STXihei"/>
+                <w:sz w:val="20"/>
+                <w:szCs w:val="20"/>
+              </w:rPr>
+              <w:t>{#is_chinese_difference}■{/is_chinese_difference}{</w:t>
+            </w:r>
+            <w:r>
+              <w:rPr>
+                <w:rFonts w:hint="default" w:ascii="STXihei" w:hAnsi="STXihei" w:eastAsia="STXihei" w:cs="STXihei"/>
+                <w:sz w:val="20"/>
+                <w:szCs w:val="20"/>
+                <w:lang w:val="en-US"/>
+              </w:rPr>
+              <w:t>^</w:t>
+            </w:r>
+            <w:r>
+              <w:rPr>
+                <w:rFonts w:hint="eastAsia" w:ascii="STXihei" w:hAnsi="STXihei" w:eastAsia="STXihei" w:cs="STXihei"/>
+                <w:sz w:val="20"/>
+                <w:szCs w:val="20"/>
+              </w:rPr>
+              <w:t>is_chinese_difference}□{/is_chinese_difference}</w:t>
+            </w:r>
+            <w:r>
+              <w:rPr>
+                <w:rFonts w:hint="eastAsia" w:ascii="STXihei" w:hAnsi="STXihei" w:eastAsia="STXihei" w:cs="STXihei"/>
                 <w:b/>
                 <w:bCs/>
                 <w:sz w:val="20"/>
@@ -6105,62 +6360,407 @@
               </w:rPr>
               <w:t xml:space="preserve"> </w:t>
             </w:r>
-            <w:r>
-              <w:rPr>
-                <w:rFonts w:ascii="STXihei" w:hAnsi="STXihei" w:eastAsia="STXihei" w:cs="STXihei"/>
-                <w:b/>
-                <w:bCs/>
-                <w:sz w:val="20"/>
-                <w:szCs w:val="20"/>
-              </w:rPr>
-              <w:t xml:space="preserve">□      </w:t>
-            </w:r>
-          </w:p>
-          <w:p>
-            <w:pPr>
-              <w:rPr>
-                <w:rFonts w:ascii="STXihei" w:hAnsi="STXihei" w:eastAsia="STXihei" w:cs="STXihei"/>
-                <w:b/>
-                <w:bCs/>
-                <w:sz w:val="20"/>
-                <w:szCs w:val="20"/>
-              </w:rPr>
-            </w:pPr>
-          </w:p>
-          <w:p>
-            <w:pPr>
-              <w:rPr>
-                <w:sz w:val="20"/>
-                <w:szCs w:val="20"/>
-              </w:rPr>
-            </w:pPr>
-            <w:r>
-              <w:rPr>
-                <w:rFonts w:ascii="STXihei" w:hAnsi="STXihei" w:eastAsia="STXihei" w:cs="STXihei"/>
-                <w:b/>
-                <w:bCs/>
-                <w:sz w:val="20"/>
-                <w:szCs w:val="20"/>
-              </w:rPr>
-              <w:t xml:space="preserve">Other其他          speak说:  Fluent 流利 □   Ordinary 普通   □   Difference 差 □                         </w:t>
-            </w:r>
-          </w:p>
-          <w:p>
-            <w:pPr>
-              <w:rPr>
-                <w:sz w:val="20"/>
-                <w:szCs w:val="20"/>
-              </w:rPr>
-            </w:pPr>
-            <w:r>
-              <w:rPr>
-                <w:rFonts w:ascii="STXihei" w:hAnsi="STXihei" w:eastAsia="STXihei" w:cs="STXihei"/>
-                <w:b/>
-                <w:bCs/>
-                <w:sz w:val="20"/>
-                <w:szCs w:val="20"/>
-              </w:rPr>
-              <w:t xml:space="preserve">                            Write写：Fluent 流利  □   Ordinary 普通   □   Difference 差 □</w:t>
+          </w:p>
+          <w:p>
+            <w:pPr>
+              <w:rPr>
+                <w:sz w:val="20"/>
+                <w:szCs w:val="20"/>
+              </w:rPr>
+            </w:pPr>
+            <w:r>
+              <w:rPr>
+                <w:rFonts w:ascii="STXihei" w:hAnsi="STXihei" w:eastAsia="STXihei" w:cs="STXihei"/>
+                <w:b/>
+                <w:bCs/>
+                <w:sz w:val="20"/>
+                <w:szCs w:val="20"/>
+              </w:rPr>
+              <w:t xml:space="preserve">                            Write写：Fluent 流利 </w:t>
+            </w:r>
+            <w:r>
+              <w:rPr>
+                <w:rFonts w:hint="eastAsia" w:ascii="STXihei" w:hAnsi="STXihei" w:eastAsia="STXihei" w:cs="STXihei"/>
+                <w:sz w:val="20"/>
+                <w:szCs w:val="20"/>
+              </w:rPr>
+              <w:t>{#is_chinese_write_fluent}■{/is_chinese_write_fluent}{</w:t>
+            </w:r>
+            <w:r>
+              <w:rPr>
+                <w:rFonts w:hint="default" w:ascii="STXihei" w:hAnsi="STXihei" w:eastAsia="STXihei" w:cs="STXihei"/>
+                <w:sz w:val="20"/>
+                <w:szCs w:val="20"/>
+                <w:lang w:val="en-US"/>
+              </w:rPr>
+              <w:t>^</w:t>
+            </w:r>
+            <w:r>
+              <w:rPr>
+                <w:rFonts w:hint="eastAsia" w:ascii="STXihei" w:hAnsi="STXihei" w:eastAsia="STXihei" w:cs="STXihei"/>
+                <w:sz w:val="20"/>
+                <w:szCs w:val="20"/>
+              </w:rPr>
+              <w:t>is_chinese_write_fluent}□{/is_chinese_write_fluent}</w:t>
+            </w:r>
+            <w:r>
+              <w:rPr>
+                <w:rFonts w:ascii="STXihei" w:hAnsi="STXihei" w:eastAsia="STXihei" w:cs="STXihei"/>
+                <w:b/>
+                <w:bCs/>
+                <w:sz w:val="20"/>
+                <w:szCs w:val="20"/>
+              </w:rPr>
+              <w:t xml:space="preserve">   Ordinary 普通  </w:t>
+            </w:r>
+            <w:r>
+              <w:rPr>
+                <w:rFonts w:hint="eastAsia" w:ascii="STXihei" w:hAnsi="STXihei" w:eastAsia="STXihei" w:cs="STXihei"/>
+                <w:sz w:val="20"/>
+                <w:szCs w:val="20"/>
+              </w:rPr>
+              <w:t>{#is_chinese_write_ordinary}■{/is_chinese_write_ordinary}{</w:t>
+            </w:r>
+            <w:r>
+              <w:rPr>
+                <w:rFonts w:hint="default" w:ascii="STXihei" w:hAnsi="STXihei" w:eastAsia="STXihei" w:cs="STXihei"/>
+                <w:sz w:val="20"/>
+                <w:szCs w:val="20"/>
+                <w:lang w:val="en-US"/>
+              </w:rPr>
+              <w:t>^</w:t>
+            </w:r>
+            <w:r>
+              <w:rPr>
+                <w:rFonts w:hint="eastAsia" w:ascii="STXihei" w:hAnsi="STXihei" w:eastAsia="STXihei" w:cs="STXihei"/>
+                <w:sz w:val="20"/>
+                <w:szCs w:val="20"/>
+              </w:rPr>
+              <w:t>is_chinese_write_ordinary}□{/is_chinese_write_ordinary}</w:t>
+            </w:r>
+            <w:r>
+              <w:rPr>
+                <w:rFonts w:hint="eastAsia" w:ascii="STXihei" w:hAnsi="STXihei" w:eastAsia="STXihei" w:cs="STXihei"/>
+                <w:b/>
+                <w:bCs/>
+                <w:sz w:val="20"/>
+                <w:szCs w:val="20"/>
+              </w:rPr>
+              <w:t xml:space="preserve">  </w:t>
+            </w:r>
+            <w:r>
+              <w:rPr>
+                <w:rFonts w:ascii="STXihei" w:hAnsi="STXihei" w:eastAsia="STXihei" w:cs="STXihei"/>
+                <w:b/>
+                <w:bCs/>
+                <w:sz w:val="20"/>
+                <w:szCs w:val="20"/>
+              </w:rPr>
+              <w:t xml:space="preserve"> Difference 差</w:t>
+            </w:r>
+            <w:r>
+              <w:rPr>
+                <w:rFonts w:hint="eastAsia" w:ascii="STXihei" w:hAnsi="STXihei" w:eastAsia="STXihei" w:cs="STXihei"/>
+                <w:b/>
+                <w:bCs/>
+                <w:sz w:val="20"/>
+                <w:szCs w:val="20"/>
+              </w:rPr>
+              <w:t xml:space="preserve"> </w:t>
+            </w:r>
+            <w:r>
+              <w:rPr>
+                <w:rFonts w:hint="eastAsia" w:ascii="STXihei" w:hAnsi="STXihei" w:eastAsia="STXihei" w:cs="STXihei"/>
+                <w:sz w:val="20"/>
+                <w:szCs w:val="20"/>
+              </w:rPr>
+              <w:t>{#is_chinese_write_difference}■{/is_chinese_write_difference}{</w:t>
+            </w:r>
+            <w:r>
+              <w:rPr>
+                <w:rFonts w:hint="default" w:ascii="STXihei" w:hAnsi="STXihei" w:eastAsia="STXihei" w:cs="STXihei"/>
+                <w:sz w:val="20"/>
+                <w:szCs w:val="20"/>
+                <w:lang w:val="en-US"/>
+              </w:rPr>
+              <w:t>^</w:t>
+            </w:r>
+            <w:r>
+              <w:rPr>
+                <w:rFonts w:hint="eastAsia" w:ascii="STXihei" w:hAnsi="STXihei" w:eastAsia="STXihei" w:cs="STXihei"/>
+                <w:sz w:val="20"/>
+                <w:szCs w:val="20"/>
+              </w:rPr>
+              <w:t>is_chinese_write_difference}□{/is_chinese_write_difference}</w:t>
+            </w:r>
+            <w:r>
+              <w:rPr>
+                <w:rFonts w:ascii="STXihei" w:hAnsi="STXihei" w:eastAsia="STXihei" w:cs="STXihei"/>
+                <w:b/>
+                <w:bCs/>
+                <w:sz w:val="20"/>
+                <w:szCs w:val="20"/>
+              </w:rPr>
+              <w:t xml:space="preserve">      </w:t>
+            </w:r>
+          </w:p>
+          <w:p>
+            <w:pPr>
+              <w:rPr>
+                <w:rFonts w:ascii="STXihei" w:hAnsi="STXihei" w:eastAsia="STXihei" w:cs="STXihei"/>
+                <w:b/>
+                <w:bCs/>
+                <w:sz w:val="20"/>
+                <w:szCs w:val="20"/>
+              </w:rPr>
+            </w:pPr>
+          </w:p>
+          <w:p>
+            <w:pPr>
+              <w:rPr>
+                <w:sz w:val="20"/>
+                <w:szCs w:val="20"/>
+              </w:rPr>
+            </w:pPr>
+            <w:r>
+              <w:rPr>
+                <w:rFonts w:ascii="STXihei" w:hAnsi="STXihei" w:eastAsia="STXihei" w:cs="STXihei"/>
+                <w:b/>
+                <w:bCs/>
+                <w:sz w:val="20"/>
+                <w:szCs w:val="20"/>
+              </w:rPr>
+              <w:t xml:space="preserve">Other其他          speak说:  Fluent 流利 </w:t>
+            </w:r>
+            <w:r>
+              <w:rPr>
+                <w:rFonts w:hint="eastAsia" w:ascii="STXihei" w:hAnsi="STXihei" w:eastAsia="STXihei" w:cs="STXihei"/>
+                <w:sz w:val="20"/>
+                <w:szCs w:val="20"/>
+              </w:rPr>
+              <w:t>{#is_other_fluent}■{/is_other_fluent}{</w:t>
+            </w:r>
+            <w:r>
+              <w:rPr>
+                <w:rFonts w:hint="default" w:ascii="STXihei" w:hAnsi="STXihei" w:eastAsia="STXihei" w:cs="STXihei"/>
+                <w:sz w:val="20"/>
+                <w:szCs w:val="20"/>
+                <w:lang w:val="en-US"/>
+              </w:rPr>
+              <w:t>^</w:t>
+            </w:r>
+            <w:r>
+              <w:rPr>
+                <w:rFonts w:hint="eastAsia" w:ascii="STXihei" w:hAnsi="STXihei" w:eastAsia="STXihei" w:cs="STXihei"/>
+                <w:sz w:val="20"/>
+                <w:szCs w:val="20"/>
+              </w:rPr>
+              <w:t>is_other_fluent}□{/is_other_fluent}</w:t>
+            </w:r>
+            <w:r>
+              <w:rPr>
+                <w:rFonts w:ascii="STXihei" w:hAnsi="STXihei" w:eastAsia="STXihei" w:cs="STXihei"/>
+                <w:b/>
+                <w:bCs/>
+                <w:sz w:val="20"/>
+                <w:szCs w:val="20"/>
+              </w:rPr>
+              <w:t xml:space="preserve">   Ordinary 普通  </w:t>
+            </w:r>
+            <w:r>
+              <w:rPr>
+                <w:rFonts w:hint="eastAsia" w:ascii="STXihei" w:hAnsi="STXihei" w:eastAsia="STXihei" w:cs="STXihei"/>
+                <w:sz w:val="20"/>
+                <w:szCs w:val="20"/>
+              </w:rPr>
+              <w:t>{#is_other_ordinary}■{/is_other_ordinary}{</w:t>
+            </w:r>
+            <w:r>
+              <w:rPr>
+                <w:rFonts w:hint="default" w:ascii="STXihei" w:hAnsi="STXihei" w:eastAsia="STXihei" w:cs="STXihei"/>
+                <w:sz w:val="20"/>
+                <w:szCs w:val="20"/>
+                <w:lang w:val="en-US"/>
+              </w:rPr>
+              <w:t>^</w:t>
+            </w:r>
+            <w:r>
+              <w:rPr>
+                <w:rFonts w:hint="eastAsia" w:ascii="STXihei" w:hAnsi="STXihei" w:eastAsia="STXihei" w:cs="STXihei"/>
+                <w:sz w:val="20"/>
+                <w:szCs w:val="20"/>
+              </w:rPr>
+              <w:t>is_other_ordinary}□{/is_other_ordinary}</w:t>
+            </w:r>
+            <w:r>
+              <w:rPr>
+                <w:rFonts w:ascii="STXihei" w:hAnsi="STXihei" w:eastAsia="STXihei" w:cs="STXihei"/>
+                <w:b/>
+                <w:bCs/>
+                <w:sz w:val="20"/>
+                <w:szCs w:val="20"/>
+              </w:rPr>
+              <w:t xml:space="preserve">   Difference 差 </w:t>
+            </w:r>
+            <w:r>
+              <w:rPr>
+                <w:rFonts w:hint="eastAsia" w:ascii="STXihei" w:hAnsi="STXihei" w:eastAsia="STXihei" w:cs="STXihei"/>
+                <w:sz w:val="20"/>
+                <w:szCs w:val="20"/>
+              </w:rPr>
+              <w:t>{#is_other_difference}■{/is_other_difference}{</w:t>
+            </w:r>
+            <w:r>
+              <w:rPr>
+                <w:rFonts w:hint="default" w:ascii="STXihei" w:hAnsi="STXihei" w:eastAsia="STXihei" w:cs="STXihei"/>
+                <w:sz w:val="20"/>
+                <w:szCs w:val="20"/>
+                <w:lang w:val="en-US"/>
+              </w:rPr>
+              <w:t>^</w:t>
+            </w:r>
+            <w:r>
+              <w:rPr>
+                <w:rFonts w:hint="eastAsia" w:ascii="STXihei" w:hAnsi="STXihei" w:eastAsia="STXihei" w:cs="STXihei"/>
+                <w:sz w:val="20"/>
+                <w:szCs w:val="20"/>
+              </w:rPr>
+              <w:t>is_other_difference}□{/is_other_difference}</w:t>
+            </w:r>
+            <w:r>
+              <w:rPr>
+                <w:rFonts w:hint="eastAsia" w:ascii="STXihei" w:hAnsi="STXihei" w:eastAsia="STXihei" w:cs="STXihei"/>
+                <w:b/>
+                <w:bCs/>
+                <w:sz w:val="20"/>
+                <w:szCs w:val="20"/>
+              </w:rPr>
+              <w:t xml:space="preserve"> </w:t>
+            </w:r>
+            <w:r>
+              <w:rPr>
+                <w:rFonts w:ascii="STXihei" w:hAnsi="STXihei" w:eastAsia="STXihei" w:cs="STXihei"/>
+                <w:b/>
+                <w:bCs/>
+                <w:sz w:val="20"/>
+                <w:szCs w:val="20"/>
+              </w:rPr>
+              <w:t xml:space="preserve">                        </w:t>
+            </w:r>
+          </w:p>
+          <w:p>
+            <w:pPr>
+              <w:rPr>
+                <w:sz w:val="20"/>
+                <w:szCs w:val="20"/>
+              </w:rPr>
+            </w:pPr>
+            <w:r>
+              <w:rPr>
+                <w:rFonts w:ascii="STXihei" w:hAnsi="STXihei" w:eastAsia="STXihei" w:cs="STXihei"/>
+                <w:b/>
+                <w:bCs/>
+                <w:sz w:val="20"/>
+                <w:szCs w:val="20"/>
+              </w:rPr>
+              <w:t xml:space="preserve">                            Write写：Fluent 流利  </w:t>
+            </w:r>
+            <w:r>
+              <w:rPr>
+                <w:rFonts w:hint="eastAsia" w:ascii="STXihei" w:hAnsi="STXihei" w:eastAsia="STXihei" w:cs="STXihei"/>
+                <w:sz w:val="20"/>
+                <w:szCs w:val="20"/>
+              </w:rPr>
+              <w:t>{#is_other_write_fluent}■{/is_other_write_fluent}{</w:t>
+            </w:r>
+            <w:r>
+              <w:rPr>
+                <w:rFonts w:hint="default" w:ascii="STXihei" w:hAnsi="STXihei" w:eastAsia="STXihei" w:cs="STXihei"/>
+                <w:sz w:val="20"/>
+                <w:szCs w:val="20"/>
+                <w:lang w:val="en-US"/>
+              </w:rPr>
+              <w:t>^</w:t>
+            </w:r>
+            <w:r>
+              <w:rPr>
+                <w:rFonts w:hint="eastAsia" w:ascii="STXihei" w:hAnsi="STXihei" w:eastAsia="STXihei" w:cs="STXihei"/>
+                <w:sz w:val="20"/>
+                <w:szCs w:val="20"/>
+              </w:rPr>
+              <w:t>is_other_write_fluent}□{/is_other_write_fluent}</w:t>
+            </w:r>
+            <w:r>
+              <w:rPr>
+                <w:rFonts w:ascii="STXihei" w:hAnsi="STXihei" w:eastAsia="STXihei" w:cs="STXihei"/>
+                <w:b/>
+                <w:bCs/>
+                <w:sz w:val="20"/>
+                <w:szCs w:val="20"/>
+              </w:rPr>
+              <w:t xml:space="preserve">  Ordinary 普通   </w:t>
+            </w:r>
+            <w:r>
+              <w:rPr>
+                <w:rFonts w:hint="eastAsia" w:ascii="STXihei" w:hAnsi="STXihei" w:eastAsia="STXihei" w:cs="STXihei"/>
+                <w:sz w:val="20"/>
+                <w:szCs w:val="20"/>
+              </w:rPr>
+              <w:t>{#is_other_write_ordinary}■{/is_other_write_ordinary}{</w:t>
+            </w:r>
+            <w:r>
+              <w:rPr>
+                <w:rFonts w:hint="default" w:ascii="STXihei" w:hAnsi="STXihei" w:eastAsia="STXihei" w:cs="STXihei"/>
+                <w:sz w:val="20"/>
+                <w:szCs w:val="20"/>
+                <w:lang w:val="en-US"/>
+              </w:rPr>
+              <w:t>^</w:t>
+            </w:r>
+            <w:r>
+              <w:rPr>
+                <w:rFonts w:hint="eastAsia" w:ascii="STXihei" w:hAnsi="STXihei" w:eastAsia="STXihei" w:cs="STXihei"/>
+                <w:sz w:val="20"/>
+                <w:szCs w:val="20"/>
+              </w:rPr>
+              <w:t>is_other_write_ordinary}□{/is_other_write_ordinary}</w:t>
+            </w:r>
+            <w:r>
+              <w:rPr>
+                <w:rFonts w:ascii="STXihei" w:hAnsi="STXihei" w:eastAsia="STXihei" w:cs="STXihei"/>
+                <w:b/>
+                <w:bCs/>
+                <w:sz w:val="20"/>
+                <w:szCs w:val="20"/>
+              </w:rPr>
+              <w:t xml:space="preserve">   Difference 差 </w:t>
+            </w:r>
+            <w:r>
+              <w:rPr>
+                <w:rFonts w:hint="eastAsia" w:ascii="STXihei" w:hAnsi="STXihei" w:eastAsia="STXihei" w:cs="STXihei"/>
+                <w:sz w:val="20"/>
+                <w:szCs w:val="20"/>
+              </w:rPr>
+              <w:t>{#is_other_write_difference}■{/is_other_write_difference}{</w:t>
+            </w:r>
+            <w:r>
+              <w:rPr>
+                <w:rFonts w:hint="default" w:ascii="STXihei" w:hAnsi="STXihei" w:eastAsia="STXihei" w:cs="STXihei"/>
+                <w:sz w:val="20"/>
+                <w:szCs w:val="20"/>
+                <w:lang w:val="en-US"/>
+              </w:rPr>
+              <w:t>^</w:t>
+            </w:r>
+            <w:bookmarkStart w:id="0" w:name="_GoBack"/>
+            <w:bookmarkEnd w:id="0"/>
+            <w:r>
+              <w:rPr>
+                <w:rFonts w:hint="eastAsia" w:ascii="STXihei" w:hAnsi="STXihei" w:eastAsia="STXihei" w:cs="STXihei"/>
+                <w:sz w:val="20"/>
+                <w:szCs w:val="20"/>
+              </w:rPr>
+              <w:t>is_other_write_difference}□{/is_other_write_difference}</w:t>
             </w:r>
           </w:p>
         </w:tc>

</xml_diff>

<commit_message>
feat: added confirmation of declaration
</commit_message>
<xml_diff>
--- a/public/template/biodata_template.docx
+++ b/public/template/biodata_template.docx
@@ -3109,12 +3109,23 @@
             <w:r>
               <w:rPr>
                 <w:rFonts w:hint="default" w:ascii="STXihei" w:hAnsi="STXihei" w:eastAsia="STXihei" w:cstheme="minorBidi"/>
-                <w:b/>
+                <w:b w:val="0"/>
+                <w:bCs/>
                 <w:sz w:val="22"/>
                 <w:szCs w:val="22"/>
                 <w:lang w:val="en-US" w:eastAsia="zh-CN"/>
               </w:rPr>
-              <w:t>{.}{/job_descriptions}</w:t>
+              <w:t>{.}</w:t>
+            </w:r>
+            <w:r>
+              <w:rPr>
+                <w:rFonts w:hint="default" w:ascii="STXihei" w:hAnsi="STXihei" w:eastAsia="STXihei" w:cstheme="minorBidi"/>
+                <w:b/>
+                <w:sz w:val="22"/>
+                <w:szCs w:val="22"/>
+                <w:lang w:val="en-US" w:eastAsia="zh-CN"/>
+              </w:rPr>
+              <w:t>{/job_descriptions}</w:t>
             </w:r>
             <w:r>
               <w:rPr>
@@ -3149,6 +3160,8 @@
               </w:rPr>
               <w:t>}</w:t>
             </w:r>
+            <w:bookmarkStart w:id="0" w:name="_GoBack"/>
+            <w:bookmarkEnd w:id="0"/>
           </w:p>
           <w:p>
             <w:pPr>
@@ -5524,8 +5537,10 @@
           <w:p>
             <w:pPr>
               <w:rPr>
-                <w:sz w:val="20"/>
-                <w:szCs w:val="20"/>
+                <w:rFonts w:hint="default"/>
+                <w:sz w:val="20"/>
+                <w:szCs w:val="20"/>
+                <w:lang w:val="en-US"/>
               </w:rPr>
             </w:pPr>
             <w:r>
@@ -5537,6 +5552,17 @@
                 <w:szCs w:val="20"/>
               </w:rPr>
               <w:t xml:space="preserve">练: </w:t>
+            </w:r>
+            <w:r>
+              <w:rPr>
+                <w:rFonts w:hint="default" w:ascii="STXihei" w:hAnsi="STXihei" w:eastAsia="STXihei" w:cs="STXihei"/>
+                <w:b w:val="0"/>
+                <w:bCs w:val="0"/>
+                <w:sz w:val="20"/>
+                <w:szCs w:val="20"/>
+                <w:lang w:val="en-US"/>
+              </w:rPr>
+              <w:t>{skill}</w:t>
             </w:r>
           </w:p>
           <w:p>
@@ -6752,8 +6778,6 @@
               </w:rPr>
               <w:t>^</w:t>
             </w:r>
-            <w:bookmarkStart w:id="0" w:name="_GoBack"/>
-            <w:bookmarkEnd w:id="0"/>
             <w:r>
               <w:rPr>
                 <w:rFonts w:hint="eastAsia" w:ascii="STXihei" w:hAnsi="STXihei" w:eastAsia="STXihei" w:cs="STXihei"/>

</xml_diff>

<commit_message>
feat: added the template for declaration in docx
</commit_message>
<xml_diff>
--- a/public/template/biodata_template.docx
+++ b/public/template/biodata_template.docx
@@ -3160,8 +3160,6 @@
               </w:rPr>
               <w:t>}</w:t>
             </w:r>
-            <w:bookmarkStart w:id="0" w:name="_GoBack"/>
-            <w:bookmarkEnd w:id="0"/>
           </w:p>
           <w:p>
             <w:pPr>
@@ -6882,26 +6880,110 @@
                 <w:sz w:val="20"/>
                 <w:szCs w:val="20"/>
               </w:rPr>
-              <w:t xml:space="preserve">YES         □                NO     </w:t>
-            </w:r>
-            <w:r>
-              <w:rPr>
-                <w:b/>
-                <w:bCs/>
-                <w:sz w:val="20"/>
-                <w:szCs w:val="20"/>
-              </w:rPr>
-              <w:t>■</w:t>
-            </w:r>
-            <w:r>
-              <w:rPr>
-                <w:rFonts w:ascii="STXihei" w:hAnsi="STXihei" w:eastAsia="STXihei" w:cs="STXihei"/>
-                <w:b/>
-                <w:bCs/>
-                <w:sz w:val="20"/>
-                <w:szCs w:val="20"/>
-              </w:rPr>
-              <w:t xml:space="preserve">      </w:t>
+              <w:t xml:space="preserve">YES  </w:t>
+            </w:r>
+            <w:r>
+              <w:rPr>
+                <w:rFonts w:hint="default" w:ascii="STXihei" w:hAnsi="STXihei" w:eastAsia="STXihei" w:cs="STXihei"/>
+                <w:b w:val="0"/>
+                <w:bCs w:val="0"/>
+                <w:sz w:val="22"/>
+                <w:szCs w:val="22"/>
+              </w:rPr>
+              <w:t>{#has_criminal_record}■{/ has_criminal_record} {</w:t>
+            </w:r>
+            <w:r>
+              <w:rPr>
+                <w:rFonts w:hint="default" w:ascii="STXihei" w:hAnsi="STXihei" w:eastAsia="STXihei" w:cs="STXihei"/>
+                <w:b w:val="0"/>
+                <w:bCs w:val="0"/>
+                <w:sz w:val="22"/>
+                <w:szCs w:val="22"/>
+                <w:lang w:val="en-US"/>
+              </w:rPr>
+              <w:t>^</w:t>
+            </w:r>
+            <w:r>
+              <w:rPr>
+                <w:rFonts w:hint="default" w:ascii="STXihei" w:hAnsi="STXihei" w:eastAsia="STXihei" w:cs="STXihei"/>
+                <w:b w:val="0"/>
+                <w:bCs w:val="0"/>
+                <w:sz w:val="22"/>
+                <w:szCs w:val="22"/>
+              </w:rPr>
+              <w:t xml:space="preserve"> has_criminal_record}□{/ has_criminal_record}</w:t>
+            </w:r>
+            <w:r>
+              <w:rPr>
+                <w:rFonts w:ascii="STXihei" w:hAnsi="STXihei" w:eastAsia="STXihei" w:cs="STXihei"/>
+                <w:b/>
+                <w:bCs/>
+                <w:sz w:val="20"/>
+                <w:szCs w:val="20"/>
+              </w:rPr>
+              <w:t xml:space="preserve">  NO  </w:t>
+            </w:r>
+            <w:r>
+              <w:rPr>
+                <w:rFonts w:hint="default" w:ascii="STXihei" w:hAnsi="STXihei" w:eastAsia="STXihei" w:cs="STXihei"/>
+                <w:b w:val="0"/>
+                <w:bCs w:val="0"/>
+                <w:sz w:val="22"/>
+                <w:szCs w:val="22"/>
+              </w:rPr>
+              <w:t>{</w:t>
+            </w:r>
+            <w:r>
+              <w:rPr>
+                <w:rFonts w:hint="default" w:ascii="STXihei" w:hAnsi="STXihei" w:eastAsia="STXihei" w:cs="STXihei"/>
+                <w:b w:val="0"/>
+                <w:bCs w:val="0"/>
+                <w:sz w:val="22"/>
+                <w:szCs w:val="22"/>
+                <w:lang w:val="en-US"/>
+              </w:rPr>
+              <w:t>^</w:t>
+            </w:r>
+            <w:r>
+              <w:rPr>
+                <w:rFonts w:hint="default" w:ascii="STXihei" w:hAnsi="STXihei" w:eastAsia="STXihei" w:cs="STXihei"/>
+                <w:b w:val="0"/>
+                <w:bCs w:val="0"/>
+                <w:sz w:val="22"/>
+                <w:szCs w:val="22"/>
+              </w:rPr>
+              <w:t>has_criminal_record}■{/ has_criminal_record} {</w:t>
+            </w:r>
+            <w:r>
+              <w:rPr>
+                <w:rFonts w:hint="default" w:ascii="STXihei" w:hAnsi="STXihei" w:eastAsia="STXihei" w:cs="STXihei"/>
+                <w:b w:val="0"/>
+                <w:bCs w:val="0"/>
+                <w:sz w:val="22"/>
+                <w:szCs w:val="22"/>
+                <w:lang w:val="en-US"/>
+              </w:rPr>
+              <w:t>#</w:t>
+            </w:r>
+            <w:r>
+              <w:rPr>
+                <w:rFonts w:hint="default" w:ascii="STXihei" w:hAnsi="STXihei" w:eastAsia="STXihei" w:cs="STXihei"/>
+                <w:b w:val="0"/>
+                <w:bCs w:val="0"/>
+                <w:sz w:val="22"/>
+                <w:szCs w:val="22"/>
+              </w:rPr>
+              <w:t xml:space="preserve"> has_criminal_record}□{/ has_criminal_record}</w:t>
+            </w:r>
+            <w:r>
+              <w:rPr>
+                <w:rFonts w:ascii="STXihei" w:hAnsi="STXihei" w:eastAsia="STXihei" w:cs="STXihei"/>
+                <w:b/>
+                <w:bCs/>
+                <w:sz w:val="20"/>
+                <w:szCs w:val="20"/>
+              </w:rPr>
+              <w:t xml:space="preserve">     </w:t>
             </w:r>
           </w:p>
         </w:tc>
@@ -6955,26 +7037,110 @@
                 <w:sz w:val="20"/>
                 <w:szCs w:val="20"/>
               </w:rPr>
-              <w:t xml:space="preserve">YES      </w:t>
-            </w:r>
-            <w:r>
-              <w:rPr>
-                <w:b/>
-                <w:bCs/>
-                <w:sz w:val="20"/>
-                <w:szCs w:val="20"/>
-              </w:rPr>
-              <w:t>■</w:t>
-            </w:r>
-            <w:r>
-              <w:rPr>
-                <w:rFonts w:ascii="STXihei" w:hAnsi="STXihei" w:eastAsia="STXihei" w:cs="STXihei"/>
-                <w:b/>
-                <w:bCs/>
-                <w:sz w:val="20"/>
-                <w:szCs w:val="20"/>
-              </w:rPr>
-              <w:t xml:space="preserve">                 NO             □</w:t>
+              <w:t xml:space="preserve">YES     </w:t>
+            </w:r>
+            <w:r>
+              <w:rPr>
+                <w:rFonts w:hint="default" w:ascii="STXihei" w:hAnsi="STXihei" w:eastAsia="STXihei" w:cs="STXihei"/>
+                <w:b w:val="0"/>
+                <w:bCs w:val="0"/>
+                <w:sz w:val="22"/>
+                <w:szCs w:val="22"/>
+              </w:rPr>
+              <w:t>{#has_education_certification}■{/ has_education_certification} {</w:t>
+            </w:r>
+            <w:r>
+              <w:rPr>
+                <w:rFonts w:hint="default" w:ascii="STXihei" w:hAnsi="STXihei" w:eastAsia="STXihei" w:cs="STXihei"/>
+                <w:b w:val="0"/>
+                <w:bCs w:val="0"/>
+                <w:sz w:val="22"/>
+                <w:szCs w:val="22"/>
+                <w:lang w:val="en-US"/>
+              </w:rPr>
+              <w:t>^</w:t>
+            </w:r>
+            <w:r>
+              <w:rPr>
+                <w:rFonts w:hint="default" w:ascii="STXihei" w:hAnsi="STXihei" w:eastAsia="STXihei" w:cs="STXihei"/>
+                <w:b w:val="0"/>
+                <w:bCs w:val="0"/>
+                <w:sz w:val="22"/>
+                <w:szCs w:val="22"/>
+              </w:rPr>
+              <w:t xml:space="preserve"> has_education_certification}□{/ has_education_certification}</w:t>
+            </w:r>
+            <w:r>
+              <w:rPr>
+                <w:rFonts w:ascii="STXihei" w:hAnsi="STXihei" w:eastAsia="STXihei" w:cs="STXihei"/>
+                <w:b/>
+                <w:bCs/>
+                <w:sz w:val="20"/>
+                <w:szCs w:val="20"/>
+              </w:rPr>
+              <w:t xml:space="preserve">                NO </w:t>
+            </w:r>
+            <w:r>
+              <w:rPr>
+                <w:rFonts w:hint="default" w:ascii="STXihei" w:hAnsi="STXihei" w:eastAsia="STXihei" w:cs="STXihei"/>
+                <w:b w:val="0"/>
+                <w:bCs w:val="0"/>
+                <w:sz w:val="22"/>
+                <w:szCs w:val="22"/>
+              </w:rPr>
+              <w:t>{</w:t>
+            </w:r>
+            <w:r>
+              <w:rPr>
+                <w:rFonts w:hint="default" w:ascii="STXihei" w:hAnsi="STXihei" w:eastAsia="STXihei" w:cs="STXihei"/>
+                <w:b w:val="0"/>
+                <w:bCs w:val="0"/>
+                <w:sz w:val="22"/>
+                <w:szCs w:val="22"/>
+                <w:lang w:val="en-US"/>
+              </w:rPr>
+              <w:t>^</w:t>
+            </w:r>
+            <w:r>
+              <w:rPr>
+                <w:rFonts w:hint="default" w:ascii="STXihei" w:hAnsi="STXihei" w:eastAsia="STXihei" w:cs="STXihei"/>
+                <w:b w:val="0"/>
+                <w:bCs w:val="0"/>
+                <w:sz w:val="22"/>
+                <w:szCs w:val="22"/>
+              </w:rPr>
+              <w:t>has_education_certification}■{/ has_education_certification} {</w:t>
+            </w:r>
+            <w:r>
+              <w:rPr>
+                <w:rFonts w:hint="default" w:ascii="STXihei" w:hAnsi="STXihei" w:eastAsia="STXihei" w:cs="STXihei"/>
+                <w:b w:val="0"/>
+                <w:bCs w:val="0"/>
+                <w:sz w:val="22"/>
+                <w:szCs w:val="22"/>
+                <w:lang w:val="en-US"/>
+              </w:rPr>
+              <w:t>#</w:t>
+            </w:r>
+            <w:r>
+              <w:rPr>
+                <w:rFonts w:hint="default" w:ascii="STXihei" w:hAnsi="STXihei" w:eastAsia="STXihei" w:cs="STXihei"/>
+                <w:b w:val="0"/>
+                <w:bCs w:val="0"/>
+                <w:sz w:val="22"/>
+                <w:szCs w:val="22"/>
+              </w:rPr>
+              <w:t xml:space="preserve"> has_education_certification}□{/ has_education_certification}</w:t>
+            </w:r>
+            <w:r>
+              <w:rPr>
+                <w:rFonts w:ascii="STXihei" w:hAnsi="STXihei" w:eastAsia="STXihei" w:cs="STXihei"/>
+                <w:b/>
+                <w:bCs/>
+                <w:sz w:val="20"/>
+                <w:szCs w:val="20"/>
+              </w:rPr>
+              <w:t xml:space="preserve"> </w:t>
             </w:r>
           </w:p>
         </w:tc>
@@ -7129,26 +7295,110 @@
                 <w:sz w:val="20"/>
                 <w:szCs w:val="20"/>
               </w:rPr>
-              <w:t xml:space="preserve">Proof of work experience工作经验证明： YES      </w:t>
-            </w:r>
-            <w:r>
-              <w:rPr>
-                <w:b/>
-                <w:bCs/>
-                <w:sz w:val="20"/>
-                <w:szCs w:val="20"/>
-              </w:rPr>
-              <w:t>■</w:t>
-            </w:r>
-            <w:r>
-              <w:rPr>
-                <w:rFonts w:ascii="STXihei" w:hAnsi="STXihei" w:eastAsia="STXihei" w:cs="STXihei"/>
-                <w:b/>
-                <w:bCs/>
-                <w:sz w:val="20"/>
-                <w:szCs w:val="20"/>
-              </w:rPr>
-              <w:t xml:space="preserve">                   NO          □</w:t>
+              <w:t xml:space="preserve">Proof of work experience工作经验证明： YES    </w:t>
+            </w:r>
+            <w:r>
+              <w:rPr>
+                <w:rFonts w:hint="default" w:ascii="STXihei" w:hAnsi="STXihei" w:eastAsia="STXihei" w:cs="STXihei"/>
+                <w:b w:val="0"/>
+                <w:bCs w:val="0"/>
+                <w:sz w:val="22"/>
+                <w:szCs w:val="22"/>
+              </w:rPr>
+              <w:t>{#has_proof_of_work_experience}■{/ has_proof_of_work_experience} {</w:t>
+            </w:r>
+            <w:r>
+              <w:rPr>
+                <w:rFonts w:hint="default" w:ascii="STXihei" w:hAnsi="STXihei" w:eastAsia="STXihei" w:cs="STXihei"/>
+                <w:b w:val="0"/>
+                <w:bCs w:val="0"/>
+                <w:sz w:val="22"/>
+                <w:szCs w:val="22"/>
+                <w:lang w:val="en-US"/>
+              </w:rPr>
+              <w:t>^</w:t>
+            </w:r>
+            <w:r>
+              <w:rPr>
+                <w:rFonts w:hint="default" w:ascii="STXihei" w:hAnsi="STXihei" w:eastAsia="STXihei" w:cs="STXihei"/>
+                <w:b w:val="0"/>
+                <w:bCs w:val="0"/>
+                <w:sz w:val="22"/>
+                <w:szCs w:val="22"/>
+              </w:rPr>
+              <w:t xml:space="preserve"> has_proof_of_work_experience}□{/ has_proof_of_work_experience}</w:t>
+            </w:r>
+            <w:r>
+              <w:rPr>
+                <w:rFonts w:ascii="STXihei" w:hAnsi="STXihei" w:eastAsia="STXihei" w:cs="STXihei"/>
+                <w:b/>
+                <w:bCs/>
+                <w:sz w:val="20"/>
+                <w:szCs w:val="20"/>
+              </w:rPr>
+              <w:t xml:space="preserve">                    NO          </w:t>
+            </w:r>
+            <w:r>
+              <w:rPr>
+                <w:rFonts w:hint="default" w:ascii="STXihei" w:hAnsi="STXihei" w:eastAsia="STXihei" w:cs="STXihei"/>
+                <w:b w:val="0"/>
+                <w:bCs w:val="0"/>
+                <w:sz w:val="22"/>
+                <w:szCs w:val="22"/>
+              </w:rPr>
+              <w:t>{</w:t>
+            </w:r>
+            <w:r>
+              <w:rPr>
+                <w:rFonts w:hint="default" w:ascii="STXihei" w:hAnsi="STXihei" w:eastAsia="STXihei" w:cs="STXihei"/>
+                <w:b w:val="0"/>
+                <w:bCs w:val="0"/>
+                <w:sz w:val="22"/>
+                <w:szCs w:val="22"/>
+                <w:lang w:val="en-US"/>
+              </w:rPr>
+              <w:t>^</w:t>
+            </w:r>
+            <w:r>
+              <w:rPr>
+                <w:rFonts w:hint="default" w:ascii="STXihei" w:hAnsi="STXihei" w:eastAsia="STXihei" w:cs="STXihei"/>
+                <w:b w:val="0"/>
+                <w:bCs w:val="0"/>
+                <w:sz w:val="22"/>
+                <w:szCs w:val="22"/>
+              </w:rPr>
+              <w:t>has_proof_of_work_experience}■{/ has_proof_of_work_experience} {</w:t>
+            </w:r>
+            <w:r>
+              <w:rPr>
+                <w:rFonts w:hint="default" w:ascii="STXihei" w:hAnsi="STXihei" w:eastAsia="STXihei" w:cs="STXihei"/>
+                <w:b w:val="0"/>
+                <w:bCs w:val="0"/>
+                <w:sz w:val="22"/>
+                <w:szCs w:val="22"/>
+                <w:lang w:val="en-US"/>
+              </w:rPr>
+              <w:t>#</w:t>
+            </w:r>
+            <w:r>
+              <w:rPr>
+                <w:rFonts w:hint="default" w:ascii="STXihei" w:hAnsi="STXihei" w:eastAsia="STXihei" w:cs="STXihei"/>
+                <w:b w:val="0"/>
+                <w:bCs w:val="0"/>
+                <w:sz w:val="22"/>
+                <w:szCs w:val="22"/>
+              </w:rPr>
+              <w:t xml:space="preserve"> has_proof_of_work_experience}□{/ has_proof_of_work_experience}</w:t>
+            </w:r>
+            <w:r>
+              <w:rPr>
+                <w:rFonts w:ascii="STXihei" w:hAnsi="STXihei" w:eastAsia="STXihei" w:cs="STXihei"/>
+                <w:b/>
+                <w:bCs/>
+                <w:sz w:val="20"/>
+                <w:szCs w:val="20"/>
+              </w:rPr>
+              <w:t xml:space="preserve"> </w:t>
             </w:r>
           </w:p>
         </w:tc>
@@ -7418,12 +7668,13 @@
           <w:p>
             <w:pPr>
               <w:rPr>
-                <w:rFonts w:ascii="STXihei" w:hAnsi="STXihei" w:eastAsia="STXihei"/>
+                <w:rFonts w:hint="default" w:ascii="STXihei" w:hAnsi="STXihei" w:eastAsia="STXihei"/>
                 <w:b/>
                 <w:spacing w:val="-10"/>
                 <w:sz w:val="20"/>
                 <w:szCs w:val="20"/>
                 <w:u w:val="single"/>
+                <w:lang w:val="en-US"/>
               </w:rPr>
             </w:pPr>
             <w:r>
@@ -7436,6 +7687,19 @@
               </w:rPr>
               <w:t>Name &amp; Signature姓名和签名：</w:t>
             </w:r>
+            <w:bookmarkStart w:id="0" w:name="_GoBack"/>
+            <w:r>
+              <w:rPr>
+                <w:rFonts w:hint="default" w:ascii="STXihei" w:hAnsi="STXihei" w:eastAsia="STXihei" w:cs="STXihei"/>
+                <w:b/>
+                <w:bCs/>
+                <w:sz w:val="20"/>
+                <w:szCs w:val="20"/>
+                <w:lang w:val="en-US"/>
+              </w:rPr>
+              <w:t>{name_and_sig}</w:t>
+            </w:r>
+            <w:bookmarkEnd w:id="0"/>
           </w:p>
           <w:p>
             <w:pPr>

</xml_diff>

<commit_message>
fix: update proficiency options and improve validation in skillLanguagesZod; adjust language proficiency flags in biodata template; enhance user guidance in declaration component
</commit_message>
<xml_diff>
--- a/public/template/biodata_template.docx
+++ b/public/template/biodata_template.docx
@@ -6079,6 +6079,17 @@
             </w:r>
             <w:r>
               <w:rPr>
+                <w:rFonts w:hint="default" w:ascii="STXihei" w:hAnsi="STXihei" w:eastAsia="STXihei" w:cs="STXihei"/>
+                <w:b w:val="0"/>
+                <w:bCs w:val="0"/>
+                <w:sz w:val="20"/>
+                <w:szCs w:val="20"/>
+                <w:lang w:val="en-US"/>
+              </w:rPr>
+              <w:t>{</w:t>
+            </w:r>
+            <w:r>
+              <w:rPr>
                 <w:rFonts w:hint="eastAsia" w:ascii="STXihei" w:hAnsi="STXihei" w:eastAsia="STXihei" w:cs="STXihei"/>
                 <w:sz w:val="20"/>
                 <w:szCs w:val="20"/>
@@ -6890,7 +6901,7 @@
                 <w:sz w:val="22"/>
                 <w:szCs w:val="22"/>
               </w:rPr>
-              <w:t>{#has_criminal_record}■{/ has_criminal_record} {</w:t>
+              <w:t>{#has_criminal_record}■{/has_criminal_record} {</w:t>
             </w:r>
             <w:r>
               <w:rPr>
@@ -6911,7 +6922,7 @@
                 <w:sz w:val="22"/>
                 <w:szCs w:val="22"/>
               </w:rPr>
-              <w:t xml:space="preserve"> has_criminal_record}□{/ has_criminal_record}</w:t>
+              <w:t>has_criminal_record}□{/has_criminal_record}</w:t>
             </w:r>
             <w:r>
               <w:rPr>
@@ -6952,7 +6963,7 @@
                 <w:sz w:val="22"/>
                 <w:szCs w:val="22"/>
               </w:rPr>
-              <w:t>has_criminal_record}■{/ has_criminal_record} {</w:t>
+              <w:t>has_criminal_record}■{/has_criminal_record} {</w:t>
             </w:r>
             <w:r>
               <w:rPr>
@@ -6973,7 +6984,7 @@
                 <w:sz w:val="22"/>
                 <w:szCs w:val="22"/>
               </w:rPr>
-              <w:t xml:space="preserve"> has_criminal_record}□{/ has_criminal_record}</w:t>
+              <w:t>has_criminal_record}□{/has_criminal_record}</w:t>
             </w:r>
             <w:r>
               <w:rPr>
@@ -7047,7 +7058,7 @@
                 <w:sz w:val="22"/>
                 <w:szCs w:val="22"/>
               </w:rPr>
-              <w:t>{#has_education_certification}■{/ has_education_certification} {</w:t>
+              <w:t>{#has_education_certification}■{/has_education_certification} {</w:t>
             </w:r>
             <w:r>
               <w:rPr>
@@ -7068,7 +7079,7 @@
                 <w:sz w:val="22"/>
                 <w:szCs w:val="22"/>
               </w:rPr>
-              <w:t xml:space="preserve"> has_education_certification}□{/ has_education_certification}</w:t>
+              <w:t>has_education_certification}□{/has_education_certification}</w:t>
             </w:r>
             <w:r>
               <w:rPr>
@@ -7109,7 +7120,7 @@
                 <w:sz w:val="22"/>
                 <w:szCs w:val="22"/>
               </w:rPr>
-              <w:t>has_education_certification}■{/ has_education_certification} {</w:t>
+              <w:t>has_education_certification}■{/has_education_certification} {</w:t>
             </w:r>
             <w:r>
               <w:rPr>
@@ -7130,7 +7141,7 @@
                 <w:sz w:val="22"/>
                 <w:szCs w:val="22"/>
               </w:rPr>
-              <w:t xml:space="preserve"> has_education_certification}□{/ has_education_certification}</w:t>
+              <w:t>has_education_certification}□{/has_education_certification}</w:t>
             </w:r>
             <w:r>
               <w:rPr>
@@ -7305,7 +7316,7 @@
                 <w:sz w:val="22"/>
                 <w:szCs w:val="22"/>
               </w:rPr>
-              <w:t>{#has_proof_of_work_experience}■{/ has_proof_of_work_experience} {</w:t>
+              <w:t>{#has_proof_of_work_experience}■{/has_proof_of_work_experience} {</w:t>
             </w:r>
             <w:r>
               <w:rPr>
@@ -7326,7 +7337,7 @@
                 <w:sz w:val="22"/>
                 <w:szCs w:val="22"/>
               </w:rPr>
-              <w:t xml:space="preserve"> has_proof_of_work_experience}□{/ has_proof_of_work_experience}</w:t>
+              <w:t>has_proof_of_work_experience}□{/has_proof_of_work_experience}</w:t>
             </w:r>
             <w:r>
               <w:rPr>
@@ -7367,7 +7378,7 @@
                 <w:sz w:val="22"/>
                 <w:szCs w:val="22"/>
               </w:rPr>
-              <w:t>has_proof_of_work_experience}■{/ has_proof_of_work_experience} {</w:t>
+              <w:t>has_proof_of_work_experience}■{/has_proof_of_work_experience} {</w:t>
             </w:r>
             <w:r>
               <w:rPr>
@@ -7388,7 +7399,7 @@
                 <w:sz w:val="22"/>
                 <w:szCs w:val="22"/>
               </w:rPr>
-              <w:t xml:space="preserve"> has_proof_of_work_experience}□{/ has_proof_of_work_experience}</w:t>
+              <w:t>has_proof_of_work_experience}□{/has_proof_of_work_experience}</w:t>
             </w:r>
             <w:r>
               <w:rPr>
@@ -7639,8 +7650,10 @@
           <w:p>
             <w:pPr>
               <w:rPr>
-                <w:sz w:val="20"/>
-                <w:szCs w:val="20"/>
+                <w:rFonts w:hint="default"/>
+                <w:sz w:val="20"/>
+                <w:szCs w:val="20"/>
+                <w:lang w:val="en-US"/>
               </w:rPr>
             </w:pPr>
             <w:r>
@@ -7653,6 +7666,30 @@
               </w:rPr>
               <w:t>Date of Application申请日期：</w:t>
             </w:r>
+            <w:r>
+              <w:rPr>
+                <w:rFonts w:hint="default" w:ascii="STXihei" w:hAnsi="STXihei" w:eastAsia="STXihei" w:cs="STXihei"/>
+                <w:b/>
+                <w:bCs/>
+                <w:sz w:val="20"/>
+                <w:szCs w:val="20"/>
+                <w:lang w:val="en-US"/>
+              </w:rPr>
+              <w:t>{date_of_application</w:t>
+            </w:r>
+            <w:bookmarkStart w:id="0" w:name="_GoBack"/>
+            <w:bookmarkEnd w:id="0"/>
+            <w:r>
+              <w:rPr>
+                <w:rFonts w:hint="default" w:ascii="STXihei" w:hAnsi="STXihei" w:eastAsia="STXihei" w:cs="STXihei"/>
+                <w:b/>
+                <w:bCs/>
+                <w:sz w:val="20"/>
+                <w:szCs w:val="20"/>
+                <w:lang w:val="en-US"/>
+              </w:rPr>
+              <w:t>}</w:t>
+            </w:r>
           </w:p>
           <w:p>
             <w:pPr>
@@ -7687,7 +7724,6 @@
               </w:rPr>
               <w:t>Name &amp; Signature姓名和签名：</w:t>
             </w:r>
-            <w:bookmarkStart w:id="0" w:name="_GoBack"/>
             <w:r>
               <w:rPr>
                 <w:rFonts w:hint="default" w:ascii="STXihei" w:hAnsi="STXihei" w:eastAsia="STXihei" w:cs="STXihei"/>
@@ -7699,7 +7735,6 @@
               </w:rPr>
               <w:t>{name_and_sig}</w:t>
             </w:r>
-            <w:bookmarkEnd w:id="0"/>
           </w:p>
           <w:p>
             <w:pPr>

</xml_diff>

<commit_message>
feat: integrated the multiple image
</commit_message>
<xml_diff>
--- a/public/template/biodata_template.docx
+++ b/public/template/biodata_template.docx
@@ -3163,7 +3163,7 @@
           </w:p>
           <w:p>
             <w:pPr>
-              <w:pStyle w:val="24"/>
+              <w:pStyle w:val="25"/>
               <w:tabs>
                 <w:tab w:val="left" w:pos="3210"/>
               </w:tabs>
@@ -3676,7 +3676,7 @@
           </w:tcPr>
           <w:p>
             <w:pPr>
-              <w:pStyle w:val="20"/>
+              <w:pStyle w:val="21"/>
               <w:spacing w:before="12"/>
               <w:ind w:left="105"/>
               <w:rPr>
@@ -3723,7 +3723,7 @@
           </w:p>
           <w:p>
             <w:pPr>
-              <w:pStyle w:val="20"/>
+              <w:pStyle w:val="21"/>
               <w:spacing w:before="12"/>
               <w:ind w:left="105"/>
               <w:rPr>
@@ -3736,701 +3736,6 @@
               </w:rPr>
             </w:pPr>
           </w:p>
-          <w:p>
-            <w:pPr>
-              <w:pStyle w:val="20"/>
-              <w:spacing w:before="12"/>
-              <w:rPr>
-                <w:rFonts w:ascii="STXihei" w:hAnsi="STXihei" w:eastAsia="STXihei"/>
-                <w:bCs/>
-                <w:spacing w:val="-2"/>
-                <w:w w:val="105"/>
-              </w:rPr>
-            </w:pPr>
-          </w:p>
-          <w:p>
-            <w:pPr>
-              <w:pStyle w:val="20"/>
-              <w:spacing w:before="12"/>
-              <w:rPr>
-                <w:rFonts w:ascii="STXihei" w:hAnsi="STXihei" w:eastAsia="STXihei"/>
-                <w:bCs/>
-                <w:spacing w:val="-2"/>
-                <w:w w:val="105"/>
-                <w:sz w:val="6"/>
-                <w:szCs w:val="6"/>
-              </w:rPr>
-            </w:pPr>
-          </w:p>
-          <w:tbl>
-            <w:tblPr>
-              <w:tblStyle w:val="9"/>
-              <w:tblW w:w="11199" w:type="dxa"/>
-              <w:tblInd w:w="0" w:type="dxa"/>
-              <w:tblBorders>
-                <w:top w:val="none" w:color="auto" w:sz="0" w:space="0"/>
-                <w:left w:val="none" w:color="auto" w:sz="0" w:space="0"/>
-                <w:bottom w:val="none" w:color="auto" w:sz="0" w:space="0"/>
-                <w:right w:val="none" w:color="auto" w:sz="0" w:space="0"/>
-                <w:insideH w:val="single" w:color="000000" w:sz="4" w:space="0"/>
-                <w:insideV w:val="single" w:color="000000" w:sz="4" w:space="0"/>
-              </w:tblBorders>
-              <w:tblLayout w:type="fixed"/>
-              <w:tblCellMar>
-                <w:top w:w="15" w:type="dxa"/>
-                <w:left w:w="15" w:type="dxa"/>
-                <w:bottom w:w="15" w:type="dxa"/>
-                <w:right w:w="15" w:type="dxa"/>
-              </w:tblCellMar>
-            </w:tblPr>
-            <w:tblGrid>
-              <w:gridCol w:w="1702"/>
-              <w:gridCol w:w="1505"/>
-              <w:gridCol w:w="1614"/>
-              <w:gridCol w:w="4394"/>
-              <w:gridCol w:w="1984"/>
-            </w:tblGrid>
-            <w:tr>
-              <w:tblPrEx>
-                <w:tblBorders>
-                  <w:top w:val="none" w:color="auto" w:sz="0" w:space="0"/>
-                  <w:left w:val="none" w:color="auto" w:sz="0" w:space="0"/>
-                  <w:bottom w:val="none" w:color="auto" w:sz="0" w:space="0"/>
-                  <w:right w:val="none" w:color="auto" w:sz="0" w:space="0"/>
-                  <w:insideH w:val="single" w:color="000000" w:sz="4" w:space="0"/>
-                  <w:insideV w:val="single" w:color="000000" w:sz="4" w:space="0"/>
-                </w:tblBorders>
-                <w:tblCellMar>
-                  <w:top w:w="15" w:type="dxa"/>
-                  <w:left w:w="15" w:type="dxa"/>
-                  <w:bottom w:w="15" w:type="dxa"/>
-                  <w:right w:w="15" w:type="dxa"/>
-                </w:tblCellMar>
-              </w:tblPrEx>
-              <w:trPr>
-                <w:trHeight w:val="736" w:hRule="atLeast"/>
-              </w:trPr>
-              <w:tc>
-                <w:tcPr>
-                  <w:tcW w:w="1702" w:type="dxa"/>
-                  <w:tcBorders>
-                    <w:top w:val="single" w:color="000000" w:sz="4" w:space="0"/>
-                    <w:left w:val="single" w:color="000000" w:sz="4" w:space="0"/>
-                    <w:bottom w:val="single" w:color="000000" w:sz="4" w:space="0"/>
-                    <w:right w:val="single" w:color="000000" w:sz="4" w:space="0"/>
-                  </w:tcBorders>
-                  <w:tcMar>
-                    <w:top w:w="15" w:type="dxa"/>
-                    <w:left w:w="108" w:type="dxa"/>
-                    <w:bottom w:w="15" w:type="dxa"/>
-                    <w:right w:w="108" w:type="dxa"/>
-                  </w:tcMar>
-                </w:tcPr>
-                <w:p>
-                  <w:pPr>
-                    <w:jc w:val="center"/>
-                    <w:rPr>
-                      <w:sz w:val="22"/>
-                      <w:szCs w:val="22"/>
-                    </w:rPr>
-                  </w:pPr>
-                  <w:r>
-                    <w:rPr>
-                      <w:rFonts w:ascii="STXihei" w:hAnsi="STXihei" w:eastAsia="STXihei" w:cs="STXihei"/>
-                      <w:b/>
-                      <w:bCs/>
-                      <w:sz w:val="22"/>
-                      <w:szCs w:val="22"/>
-                    </w:rPr>
-                    <w:t>From</w:t>
-                  </w:r>
-                </w:p>
-                <w:p>
-                  <w:pPr>
-                    <w:jc w:val="center"/>
-                    <w:rPr>
-                      <w:sz w:val="22"/>
-                      <w:szCs w:val="22"/>
-                    </w:rPr>
-                  </w:pPr>
-                  <w:r>
-                    <w:rPr>
-                      <w:rFonts w:ascii="STXihei" w:hAnsi="STXihei" w:eastAsia="STXihei" w:cs="STXihei"/>
-                      <w:b/>
-                      <w:bCs/>
-                      <w:sz w:val="22"/>
-                      <w:szCs w:val="22"/>
-                    </w:rPr>
-                    <w:t>自</w:t>
-                  </w:r>
-                </w:p>
-              </w:tc>
-              <w:tc>
-                <w:tcPr>
-                  <w:tcW w:w="1505" w:type="dxa"/>
-                  <w:tcBorders>
-                    <w:top w:val="single" w:color="000000" w:sz="4" w:space="0"/>
-                    <w:left w:val="single" w:color="000000" w:sz="4" w:space="0"/>
-                    <w:bottom w:val="single" w:color="000000" w:sz="4" w:space="0"/>
-                    <w:right w:val="single" w:color="000000" w:sz="4" w:space="0"/>
-                  </w:tcBorders>
-                  <w:tcMar>
-                    <w:top w:w="15" w:type="dxa"/>
-                    <w:left w:w="108" w:type="dxa"/>
-                    <w:bottom w:w="15" w:type="dxa"/>
-                    <w:right w:w="108" w:type="dxa"/>
-                  </w:tcMar>
-                </w:tcPr>
-                <w:p>
-                  <w:pPr>
-                    <w:jc w:val="center"/>
-                    <w:rPr>
-                      <w:sz w:val="22"/>
-                      <w:szCs w:val="22"/>
-                    </w:rPr>
-                  </w:pPr>
-                  <w:r>
-                    <w:rPr>
-                      <w:rFonts w:ascii="STXihei" w:hAnsi="STXihei" w:eastAsia="STXihei" w:cs="STXihei"/>
-                      <w:b/>
-                      <w:bCs/>
-                      <w:sz w:val="22"/>
-                      <w:szCs w:val="22"/>
-                    </w:rPr>
-                    <w:t>To</w:t>
-                  </w:r>
-                </w:p>
-                <w:p>
-                  <w:pPr>
-                    <w:jc w:val="center"/>
-                    <w:rPr>
-                      <w:sz w:val="22"/>
-                      <w:szCs w:val="22"/>
-                    </w:rPr>
-                  </w:pPr>
-                  <w:r>
-                    <w:rPr>
-                      <w:rFonts w:ascii="STXihei" w:hAnsi="STXihei" w:eastAsia="STXihei" w:cs="STXihei"/>
-                      <w:b/>
-                      <w:bCs/>
-                      <w:sz w:val="22"/>
-                      <w:szCs w:val="22"/>
-                    </w:rPr>
-                    <w:t>至</w:t>
-                  </w:r>
-                </w:p>
-              </w:tc>
-              <w:tc>
-                <w:tcPr>
-                  <w:tcW w:w="1614" w:type="dxa"/>
-                  <w:tcBorders>
-                    <w:top w:val="single" w:color="000000" w:sz="4" w:space="0"/>
-                    <w:left w:val="single" w:color="000000" w:sz="4" w:space="0"/>
-                    <w:bottom w:val="single" w:color="000000" w:sz="4" w:space="0"/>
-                    <w:right w:val="single" w:color="000000" w:sz="4" w:space="0"/>
-                  </w:tcBorders>
-                  <w:tcMar>
-                    <w:top w:w="15" w:type="dxa"/>
-                    <w:left w:w="108" w:type="dxa"/>
-                    <w:bottom w:w="15" w:type="dxa"/>
-                    <w:right w:w="108" w:type="dxa"/>
-                  </w:tcMar>
-                </w:tcPr>
-                <w:p>
-                  <w:pPr>
-                    <w:jc w:val="center"/>
-                    <w:rPr>
-                      <w:sz w:val="22"/>
-                      <w:szCs w:val="22"/>
-                    </w:rPr>
-                  </w:pPr>
-                  <w:r>
-                    <w:rPr>
-                      <w:rFonts w:ascii="STXihei" w:hAnsi="STXihei" w:eastAsia="STXihei" w:cs="STXihei"/>
-                      <w:b/>
-                      <w:bCs/>
-                      <w:sz w:val="22"/>
-                      <w:szCs w:val="22"/>
-                    </w:rPr>
-                    <w:t>Position</w:t>
-                  </w:r>
-                </w:p>
-                <w:p>
-                  <w:pPr>
-                    <w:jc w:val="center"/>
-                    <w:rPr>
-                      <w:sz w:val="22"/>
-                      <w:szCs w:val="22"/>
-                    </w:rPr>
-                  </w:pPr>
-                  <w:r>
-                    <w:rPr>
-                      <w:rFonts w:ascii="STXihei" w:hAnsi="STXihei" w:eastAsia="STXihei" w:cs="STXihei"/>
-                      <w:b/>
-                      <w:bCs/>
-                      <w:sz w:val="22"/>
-                      <w:szCs w:val="22"/>
-                    </w:rPr>
-                    <w:t>职位</w:t>
-                  </w:r>
-                </w:p>
-              </w:tc>
-              <w:tc>
-                <w:tcPr>
-                  <w:tcW w:w="4394" w:type="dxa"/>
-                  <w:tcBorders>
-                    <w:top w:val="single" w:color="000000" w:sz="4" w:space="0"/>
-                    <w:left w:val="single" w:color="000000" w:sz="4" w:space="0"/>
-                    <w:bottom w:val="single" w:color="000000" w:sz="4" w:space="0"/>
-                    <w:right w:val="single" w:color="000000" w:sz="4" w:space="0"/>
-                  </w:tcBorders>
-                  <w:tcMar>
-                    <w:top w:w="15" w:type="dxa"/>
-                    <w:left w:w="108" w:type="dxa"/>
-                    <w:bottom w:w="15" w:type="dxa"/>
-                    <w:right w:w="108" w:type="dxa"/>
-                  </w:tcMar>
-                </w:tcPr>
-                <w:p>
-                  <w:pPr>
-                    <w:jc w:val="center"/>
-                    <w:rPr>
-                      <w:sz w:val="22"/>
-                      <w:szCs w:val="22"/>
-                    </w:rPr>
-                  </w:pPr>
-                  <w:r>
-                    <w:rPr>
-                      <w:rFonts w:ascii="STXihei" w:hAnsi="STXihei" w:eastAsia="STXihei" w:cs="STXihei"/>
-                      <w:b/>
-                      <w:bCs/>
-                      <w:sz w:val="22"/>
-                      <w:szCs w:val="22"/>
-                    </w:rPr>
-                    <w:t>Name &amp; Address of Company</w:t>
-                  </w:r>
-                </w:p>
-                <w:p>
-                  <w:pPr>
-                    <w:jc w:val="center"/>
-                    <w:rPr>
-                      <w:sz w:val="22"/>
-                      <w:szCs w:val="22"/>
-                    </w:rPr>
-                  </w:pPr>
-                  <w:r>
-                    <w:rPr>
-                      <w:rFonts w:ascii="STXihei" w:hAnsi="STXihei" w:eastAsia="STXihei" w:cs="STXihei"/>
-                      <w:b/>
-                      <w:bCs/>
-                      <w:sz w:val="22"/>
-                      <w:szCs w:val="22"/>
-                    </w:rPr>
-                    <w:t>机构名称和地址</w:t>
-                  </w:r>
-                </w:p>
-              </w:tc>
-              <w:tc>
-                <w:tcPr>
-                  <w:tcW w:w="1984" w:type="dxa"/>
-                  <w:tcBorders>
-                    <w:top w:val="single" w:color="000000" w:sz="4" w:space="0"/>
-                    <w:left w:val="single" w:color="000000" w:sz="4" w:space="0"/>
-                    <w:bottom w:val="single" w:color="000000" w:sz="4" w:space="0"/>
-                    <w:right w:val="single" w:color="000000" w:sz="4" w:space="0"/>
-                  </w:tcBorders>
-                  <w:tcMar>
-                    <w:top w:w="15" w:type="dxa"/>
-                    <w:left w:w="108" w:type="dxa"/>
-                    <w:bottom w:w="15" w:type="dxa"/>
-                    <w:right w:w="108" w:type="dxa"/>
-                  </w:tcMar>
-                </w:tcPr>
-                <w:p>
-                  <w:pPr>
-                    <w:jc w:val="center"/>
-                    <w:rPr>
-                      <w:sz w:val="22"/>
-                      <w:szCs w:val="22"/>
-                    </w:rPr>
-                  </w:pPr>
-                  <w:r>
-                    <w:rPr>
-                      <w:rFonts w:ascii="STXihei" w:hAnsi="STXihei" w:eastAsia="STXihei" w:cs="STXihei"/>
-                      <w:b/>
-                      <w:bCs/>
-                      <w:sz w:val="22"/>
-                      <w:szCs w:val="22"/>
-                    </w:rPr>
-                    <w:t>Reason for Leaving</w:t>
-                  </w:r>
-                </w:p>
-                <w:p>
-                  <w:pPr>
-                    <w:jc w:val="center"/>
-                    <w:rPr>
-                      <w:sz w:val="22"/>
-                      <w:szCs w:val="22"/>
-                    </w:rPr>
-                  </w:pPr>
-                  <w:r>
-                    <w:rPr>
-                      <w:rFonts w:ascii="STXihei" w:hAnsi="STXihei" w:eastAsia="STXihei" w:cs="STXihei"/>
-                      <w:b/>
-                      <w:bCs/>
-                      <w:sz w:val="22"/>
-                      <w:szCs w:val="22"/>
-                    </w:rPr>
-                    <w:t>离职原因</w:t>
-                  </w:r>
-                </w:p>
-              </w:tc>
-            </w:tr>
-            <w:tr>
-              <w:tblPrEx>
-                <w:tblBorders>
-                  <w:top w:val="none" w:color="auto" w:sz="0" w:space="0"/>
-                  <w:left w:val="none" w:color="auto" w:sz="0" w:space="0"/>
-                  <w:bottom w:val="none" w:color="auto" w:sz="0" w:space="0"/>
-                  <w:right w:val="none" w:color="auto" w:sz="0" w:space="0"/>
-                  <w:insideH w:val="single" w:color="000000" w:sz="4" w:space="0"/>
-                  <w:insideV w:val="single" w:color="000000" w:sz="4" w:space="0"/>
-                </w:tblBorders>
-                <w:tblCellMar>
-                  <w:top w:w="15" w:type="dxa"/>
-                  <w:left w:w="15" w:type="dxa"/>
-                  <w:bottom w:w="15" w:type="dxa"/>
-                  <w:right w:w="15" w:type="dxa"/>
-                </w:tblCellMar>
-              </w:tblPrEx>
-              <w:trPr>
-                <w:trHeight w:val="471" w:hRule="atLeast"/>
-              </w:trPr>
-              <w:tc>
-                <w:tcPr>
-                  <w:tcW w:w="1702" w:type="dxa"/>
-                  <w:tcBorders>
-                    <w:top w:val="single" w:color="000000" w:sz="4" w:space="0"/>
-                    <w:left w:val="single" w:color="000000" w:sz="4" w:space="0"/>
-                    <w:bottom w:val="single" w:color="000000" w:sz="4" w:space="0"/>
-                    <w:right w:val="single" w:color="000000" w:sz="4" w:space="0"/>
-                  </w:tcBorders>
-                  <w:tcMar>
-                    <w:top w:w="15" w:type="dxa"/>
-                    <w:left w:w="108" w:type="dxa"/>
-                    <w:bottom w:w="15" w:type="dxa"/>
-                    <w:right w:w="108" w:type="dxa"/>
-                  </w:tcMar>
-                </w:tcPr>
-                <w:p>
-                  <w:pPr>
-                    <w:jc w:val="center"/>
-                    <w:rPr>
-                      <w:rFonts w:ascii="STXihei" w:hAnsi="STXihei" w:eastAsia="STXihei"/>
-                      <w:sz w:val="22"/>
-                      <w:szCs w:val="22"/>
-                    </w:rPr>
-                  </w:pPr>
-                </w:p>
-              </w:tc>
-              <w:tc>
-                <w:tcPr>
-                  <w:tcW w:w="1505" w:type="dxa"/>
-                  <w:tcBorders>
-                    <w:top w:val="single" w:color="000000" w:sz="4" w:space="0"/>
-                    <w:left w:val="single" w:color="000000" w:sz="4" w:space="0"/>
-                    <w:bottom w:val="single" w:color="000000" w:sz="4" w:space="0"/>
-                    <w:right w:val="single" w:color="000000" w:sz="4" w:space="0"/>
-                  </w:tcBorders>
-                  <w:tcMar>
-                    <w:top w:w="15" w:type="dxa"/>
-                    <w:left w:w="108" w:type="dxa"/>
-                    <w:bottom w:w="15" w:type="dxa"/>
-                    <w:right w:w="108" w:type="dxa"/>
-                  </w:tcMar>
-                </w:tcPr>
-                <w:p>
-                  <w:pPr>
-                    <w:jc w:val="center"/>
-                    <w:rPr>
-                      <w:rFonts w:ascii="STXihei" w:hAnsi="STXihei" w:eastAsia="STXihei"/>
-                      <w:sz w:val="22"/>
-                      <w:szCs w:val="22"/>
-                    </w:rPr>
-                  </w:pPr>
-                </w:p>
-              </w:tc>
-              <w:tc>
-                <w:tcPr>
-                  <w:tcW w:w="1614" w:type="dxa"/>
-                  <w:tcBorders>
-                    <w:top w:val="single" w:color="000000" w:sz="4" w:space="0"/>
-                    <w:left w:val="single" w:color="000000" w:sz="4" w:space="0"/>
-                    <w:bottom w:val="single" w:color="000000" w:sz="4" w:space="0"/>
-                    <w:right w:val="single" w:color="000000" w:sz="4" w:space="0"/>
-                  </w:tcBorders>
-                  <w:tcMar>
-                    <w:top w:w="15" w:type="dxa"/>
-                    <w:left w:w="108" w:type="dxa"/>
-                    <w:bottom w:w="15" w:type="dxa"/>
-                    <w:right w:w="108" w:type="dxa"/>
-                  </w:tcMar>
-                </w:tcPr>
-                <w:p>
-                  <w:pPr>
-                    <w:jc w:val="center"/>
-                    <w:rPr>
-                      <w:rFonts w:ascii="STXihei" w:hAnsi="STXihei" w:eastAsia="STXihei"/>
-                      <w:sz w:val="22"/>
-                      <w:szCs w:val="22"/>
-                    </w:rPr>
-                  </w:pPr>
-                </w:p>
-              </w:tc>
-              <w:tc>
-                <w:tcPr>
-                  <w:tcW w:w="4394" w:type="dxa"/>
-                  <w:tcBorders>
-                    <w:top w:val="single" w:color="000000" w:sz="4" w:space="0"/>
-                    <w:left w:val="single" w:color="000000" w:sz="4" w:space="0"/>
-                    <w:bottom w:val="single" w:color="000000" w:sz="4" w:space="0"/>
-                    <w:right w:val="single" w:color="000000" w:sz="4" w:space="0"/>
-                  </w:tcBorders>
-                  <w:tcMar>
-                    <w:top w:w="15" w:type="dxa"/>
-                    <w:left w:w="108" w:type="dxa"/>
-                    <w:bottom w:w="15" w:type="dxa"/>
-                    <w:right w:w="108" w:type="dxa"/>
-                  </w:tcMar>
-                </w:tcPr>
-                <w:p>
-                  <w:pPr>
-                    <w:jc w:val="center"/>
-                    <w:rPr>
-                      <w:rFonts w:ascii="STXihei" w:hAnsi="STXihei" w:eastAsia="STXihei"/>
-                      <w:sz w:val="22"/>
-                      <w:szCs w:val="22"/>
-                    </w:rPr>
-                  </w:pPr>
-                </w:p>
-              </w:tc>
-              <w:tc>
-                <w:tcPr>
-                  <w:tcW w:w="1984" w:type="dxa"/>
-                  <w:tcBorders>
-                    <w:top w:val="single" w:color="000000" w:sz="4" w:space="0"/>
-                    <w:left w:val="single" w:color="000000" w:sz="4" w:space="0"/>
-                    <w:bottom w:val="single" w:color="000000" w:sz="4" w:space="0"/>
-                    <w:right w:val="single" w:color="000000" w:sz="4" w:space="0"/>
-                  </w:tcBorders>
-                  <w:tcMar>
-                    <w:top w:w="15" w:type="dxa"/>
-                    <w:left w:w="108" w:type="dxa"/>
-                    <w:bottom w:w="15" w:type="dxa"/>
-                    <w:right w:w="108" w:type="dxa"/>
-                  </w:tcMar>
-                </w:tcPr>
-                <w:p>
-                  <w:pPr>
-                    <w:jc w:val="center"/>
-                    <w:rPr>
-                      <w:rFonts w:ascii="STXihei" w:hAnsi="STXihei" w:eastAsia="STXihei"/>
-                      <w:sz w:val="22"/>
-                      <w:szCs w:val="22"/>
-                    </w:rPr>
-                  </w:pPr>
-                </w:p>
-              </w:tc>
-            </w:tr>
-            <w:tr>
-              <w:tblPrEx>
-                <w:tblBorders>
-                  <w:top w:val="none" w:color="auto" w:sz="0" w:space="0"/>
-                  <w:left w:val="none" w:color="auto" w:sz="0" w:space="0"/>
-                  <w:bottom w:val="none" w:color="auto" w:sz="0" w:space="0"/>
-                  <w:right w:val="none" w:color="auto" w:sz="0" w:space="0"/>
-                  <w:insideH w:val="single" w:color="000000" w:sz="4" w:space="0"/>
-                  <w:insideV w:val="single" w:color="000000" w:sz="4" w:space="0"/>
-                </w:tblBorders>
-                <w:tblCellMar>
-                  <w:top w:w="15" w:type="dxa"/>
-                  <w:left w:w="15" w:type="dxa"/>
-                  <w:bottom w:w="15" w:type="dxa"/>
-                  <w:right w:w="15" w:type="dxa"/>
-                </w:tblCellMar>
-              </w:tblPrEx>
-              <w:trPr>
-                <w:trHeight w:val="35" w:hRule="atLeast"/>
-              </w:trPr>
-              <w:tc>
-                <w:tcPr>
-                  <w:tcW w:w="11199" w:type="dxa"/>
-                  <w:gridSpan w:val="5"/>
-                  <w:tcBorders>
-                    <w:top w:val="single" w:color="000000" w:sz="4" w:space="0"/>
-                    <w:left w:val="single" w:color="000000" w:sz="4" w:space="0"/>
-                    <w:bottom w:val="single" w:color="000000" w:sz="4" w:space="0"/>
-                    <w:right w:val="single" w:color="000000" w:sz="4" w:space="0"/>
-                  </w:tcBorders>
-                  <w:tcMar>
-                    <w:top w:w="15" w:type="dxa"/>
-                    <w:left w:w="108" w:type="dxa"/>
-                    <w:bottom w:w="15" w:type="dxa"/>
-                    <w:right w:w="108" w:type="dxa"/>
-                  </w:tcMar>
-                </w:tcPr>
-                <w:p>
-                  <w:pPr>
-                    <w:pStyle w:val="20"/>
-                    <w:spacing w:before="12"/>
-                    <w:ind w:left="105"/>
-                    <w:rPr>
-                      <w:rFonts w:ascii="STXihei" w:hAnsi="STXihei" w:eastAsia="STXihei"/>
-                      <w:b/>
-                      <w:spacing w:val="-2"/>
-                      <w:w w:val="105"/>
-                    </w:rPr>
-                  </w:pPr>
-                  <w:r>
-                    <w:rPr>
-                      <w:rFonts w:ascii="STXihei" w:hAnsi="STXihei" w:eastAsia="STXihei"/>
-                      <w:b/>
-                      <w:w w:val="105"/>
-                    </w:rPr>
-                    <w:t>Job</w:t>
-                  </w:r>
-                  <w:r>
-                    <w:rPr>
-                      <w:rFonts w:ascii="STXihei" w:hAnsi="STXihei" w:eastAsia="STXihei"/>
-                      <w:b/>
-                      <w:spacing w:val="-2"/>
-                      <w:w w:val="105"/>
-                    </w:rPr>
-                    <w:t xml:space="preserve"> </w:t>
-                  </w:r>
-                  <w:r>
-                    <w:rPr>
-                      <w:rFonts w:ascii="STXihei" w:hAnsi="STXihei" w:eastAsia="STXihei"/>
-                      <w:b/>
-                      <w:w w:val="105"/>
-                    </w:rPr>
-                    <w:t xml:space="preserve">description </w:t>
-                  </w:r>
-                  <w:r>
-                    <w:rPr>
-                      <w:rFonts w:ascii="STXihei" w:hAnsi="STXihei" w:eastAsia="STXihei"/>
-                      <w:b/>
-                      <w:spacing w:val="-2"/>
-                      <w:w w:val="105"/>
-                    </w:rPr>
-                    <w:t>职位描述：</w:t>
-                  </w:r>
-                </w:p>
-                <w:p>
-                  <w:pPr>
-                    <w:pStyle w:val="20"/>
-                    <w:spacing w:before="12"/>
-                    <w:ind w:left="105"/>
-                    <w:rPr>
-                      <w:rFonts w:ascii="STXihei" w:hAnsi="STXihei" w:eastAsia="STXihei"/>
-                      <w:b/>
-                      <w:spacing w:val="-2"/>
-                      <w:w w:val="105"/>
-                      <w:sz w:val="6"/>
-                      <w:szCs w:val="6"/>
-                    </w:rPr>
-                  </w:pPr>
-                </w:p>
-                <w:p>
-                  <w:pPr>
-                    <w:pStyle w:val="20"/>
-                    <w:spacing w:before="12"/>
-                    <w:rPr>
-                      <w:rFonts w:ascii="STXihei" w:hAnsi="STXihei" w:eastAsia="STXihei"/>
-                      <w:bCs/>
-                      <w:spacing w:val="-2"/>
-                      <w:w w:val="105"/>
-                    </w:rPr>
-                  </w:pPr>
-                </w:p>
-                <w:p>
-                  <w:pPr>
-                    <w:pStyle w:val="20"/>
-                    <w:spacing w:before="12"/>
-                    <w:rPr>
-                      <w:rFonts w:ascii="STXihei" w:hAnsi="STXihei" w:eastAsia="STXihei"/>
-                      <w:bCs/>
-                      <w:spacing w:val="-2"/>
-                      <w:w w:val="105"/>
-                    </w:rPr>
-                  </w:pPr>
-                </w:p>
-                <w:p>
-                  <w:pPr>
-                    <w:pStyle w:val="20"/>
-                    <w:spacing w:before="12"/>
-                    <w:rPr>
-                      <w:rFonts w:ascii="STXihei" w:hAnsi="STXihei" w:eastAsia="STXihei"/>
-                      <w:bCs/>
-                      <w:spacing w:val="-2"/>
-                      <w:w w:val="105"/>
-                    </w:rPr>
-                  </w:pPr>
-                </w:p>
-                <w:p>
-                  <w:pPr>
-                    <w:pStyle w:val="20"/>
-                    <w:spacing w:before="12"/>
-                    <w:rPr>
-                      <w:rFonts w:ascii="STXihei" w:hAnsi="STXihei" w:eastAsia="STXihei"/>
-                      <w:bCs/>
-                      <w:spacing w:val="-2"/>
-                      <w:w w:val="105"/>
-                    </w:rPr>
-                  </w:pPr>
-                </w:p>
-                <w:p>
-                  <w:pPr>
-                    <w:pStyle w:val="20"/>
-                    <w:spacing w:before="12"/>
-                    <w:rPr>
-                      <w:rFonts w:ascii="STXihei" w:hAnsi="STXihei" w:eastAsia="STXihei"/>
-                      <w:bCs/>
-                      <w:spacing w:val="-2"/>
-                      <w:w w:val="105"/>
-                    </w:rPr>
-                  </w:pPr>
-                </w:p>
-                <w:p>
-                  <w:pPr>
-                    <w:pStyle w:val="20"/>
-                    <w:spacing w:before="12"/>
-                    <w:rPr>
-                      <w:rFonts w:ascii="STXihei" w:hAnsi="STXihei" w:eastAsia="STXihei"/>
-                      <w:bCs/>
-                      <w:spacing w:val="-2"/>
-                      <w:w w:val="105"/>
-                      <w:sz w:val="6"/>
-                      <w:szCs w:val="6"/>
-                    </w:rPr>
-                  </w:pPr>
-                </w:p>
-                <w:p>
-                  <w:pPr>
-                    <w:tabs>
-                      <w:tab w:val="left" w:pos="3210"/>
-                    </w:tabs>
-                    <w:spacing w:after="200" w:line="276" w:lineRule="auto"/>
-                    <w:rPr>
-                      <w:rFonts w:ascii="STXihei" w:hAnsi="STXihei" w:eastAsia="STXihei" w:cs="STXihei"/>
-                      <w:sz w:val="22"/>
-                      <w:szCs w:val="22"/>
-                    </w:rPr>
-                  </w:pPr>
-                </w:p>
-              </w:tc>
-            </w:tr>
-          </w:tbl>
           <w:p>
             <w:pPr>
               <w:tabs>
@@ -4485,7 +3790,7 @@
           </w:tcPr>
           <w:p>
             <w:pPr>
-              <w:pStyle w:val="20"/>
+              <w:pStyle w:val="21"/>
               <w:spacing w:before="12"/>
               <w:ind w:left="105"/>
               <w:rPr>
@@ -5764,18 +5069,7 @@
                 <w:szCs w:val="20"/>
                 <w:lang w:val="en-US"/>
               </w:rPr>
-              <w:t>{</w:t>
-            </w:r>
-            <w:r>
-              <w:rPr>
-                <w:rFonts w:hint="default" w:ascii="STXihei" w:hAnsi="STXihei" w:eastAsia="STXihei" w:cs="STXihei"/>
-                <w:b w:val="0"/>
-                <w:bCs w:val="0"/>
-                <w:sz w:val="20"/>
-                <w:szCs w:val="20"/>
-                <w:lang w:val="en-US"/>
-              </w:rPr>
-              <w:t>passport_valid_from}</w:t>
+              <w:t>{passport_valid_from}</w:t>
             </w:r>
             <w:r>
               <w:rPr>
@@ -7537,7 +6831,7 @@
           </w:p>
           <w:p>
             <w:pPr>
-              <w:pStyle w:val="20"/>
+              <w:pStyle w:val="21"/>
               <w:spacing w:before="17"/>
               <w:ind w:left="105"/>
               <w:rPr>
@@ -7569,7 +6863,7 @@
           </w:p>
           <w:p>
             <w:pPr>
-              <w:pStyle w:val="20"/>
+              <w:pStyle w:val="21"/>
               <w:spacing w:before="17"/>
               <w:ind w:left="105"/>
               <w:rPr>
@@ -7671,24 +6965,14 @@
                 <w:rFonts w:hint="default" w:ascii="STXihei" w:hAnsi="STXihei" w:eastAsia="STXihei" w:cs="STXihei"/>
                 <w:b/>
                 <w:bCs/>
-                <w:sz w:val="20"/>
-                <w:szCs w:val="20"/>
-                <w:lang w:val="en-US"/>
-              </w:rPr>
-              <w:t>{date_of_application</w:t>
-            </w:r>
-            <w:bookmarkStart w:id="0" w:name="_GoBack"/>
-            <w:bookmarkEnd w:id="0"/>
-            <w:r>
-              <w:rPr>
-                <w:rFonts w:hint="default" w:ascii="STXihei" w:hAnsi="STXihei" w:eastAsia="STXihei" w:cs="STXihei"/>
-                <w:b/>
-                <w:bCs/>
-                <w:sz w:val="20"/>
-                <w:szCs w:val="20"/>
-                <w:lang w:val="en-US"/>
-              </w:rPr>
-              <w:t>}</w:t>
+                <w:strike w:val="0"/>
+                <w:dstrike w:val="0"/>
+                <w:sz w:val="20"/>
+                <w:szCs w:val="20"/>
+                <w:u w:val="single"/>
+                <w:lang w:val="en-US"/>
+              </w:rPr>
+              <w:t>{date_of_application}</w:t>
             </w:r>
           </w:p>
           <w:p>
@@ -7731,6 +7015,7 @@
                 <w:bCs/>
                 <w:sz w:val="20"/>
                 <w:szCs w:val="20"/>
+                <w:u w:val="single"/>
                 <w:lang w:val="en-US"/>
               </w:rPr>
               <w:t>{name_and_sig}</w:t>
@@ -7764,11 +7049,168 @@
           <w:tab w:val="left" w:pos="3048"/>
         </w:tabs>
         <w:rPr>
-          <w:rFonts w:ascii="Microsoft YaHei" w:hAnsi="Microsoft YaHei" w:eastAsia="Microsoft YaHei" w:cs="Microsoft YaHei"/>
+          <w:rFonts w:hint="default" w:ascii="Microsoft YaHei" w:hAnsi="Microsoft YaHei" w:eastAsia="Microsoft YaHei" w:cs="Microsoft YaHei"/>
           <w:sz w:val="20"/>
           <w:szCs w:val="20"/>
+          <w:lang w:val="en-US"/>
         </w:rPr>
       </w:pPr>
+    </w:p>
+    <w:p>
+      <w:pPr>
+        <w:tabs>
+          <w:tab w:val="left" w:pos="3048"/>
+        </w:tabs>
+        <w:rPr>
+          <w:rFonts w:hint="default" w:ascii="Microsoft YaHei" w:hAnsi="Microsoft YaHei" w:eastAsia="Microsoft YaHei" w:cs="Microsoft YaHei"/>
+          <w:sz w:val="20"/>
+          <w:szCs w:val="20"/>
+          <w:lang w:val="en-US"/>
+        </w:rPr>
+      </w:pPr>
+      <w:r>
+        <w:rPr>
+          <w:rFonts w:hint="default" w:ascii="Microsoft YaHei" w:hAnsi="Microsoft YaHei" w:eastAsia="Microsoft YaHei" w:cs="Microsoft YaHei"/>
+          <w:sz w:val="20"/>
+          <w:szCs w:val="20"/>
+          <w:lang w:val="en-US"/>
+        </w:rPr>
+        <w:t>{%whole_body_picture_base64}</w:t>
+      </w:r>
+    </w:p>
+    <w:p>
+      <w:pPr>
+        <w:tabs>
+          <w:tab w:val="left" w:pos="3048"/>
+        </w:tabs>
+        <w:rPr>
+          <w:rFonts w:hint="default" w:ascii="Microsoft YaHei" w:hAnsi="Microsoft YaHei" w:eastAsia="Microsoft YaHei" w:cs="Microsoft YaHei"/>
+          <w:sz w:val="20"/>
+          <w:szCs w:val="20"/>
+          <w:lang w:val="en-US"/>
+        </w:rPr>
+      </w:pPr>
+      <w:r>
+        <w:rPr>
+          <w:rFonts w:hint="default" w:ascii="Microsoft YaHei" w:hAnsi="Microsoft YaHei" w:eastAsia="Microsoft YaHei" w:cs="Microsoft YaHei"/>
+          <w:sz w:val="20"/>
+          <w:szCs w:val="20"/>
+          <w:lang w:val="en-US"/>
+        </w:rPr>
+        <w:t>{%passport_base64}</w:t>
+      </w:r>
+    </w:p>
+    <w:p>
+      <w:pPr>
+        <w:tabs>
+          <w:tab w:val="left" w:pos="3048"/>
+        </w:tabs>
+        <w:rPr>
+          <w:rFonts w:hint="default" w:ascii="Microsoft YaHei" w:hAnsi="Microsoft YaHei" w:eastAsia="Microsoft YaHei" w:cs="Microsoft YaHei"/>
+          <w:sz w:val="20"/>
+          <w:szCs w:val="20"/>
+          <w:lang w:val="en-US"/>
+        </w:rPr>
+      </w:pPr>
+      <w:r>
+        <w:rPr>
+          <w:rFonts w:hint="default" w:ascii="Microsoft YaHei" w:hAnsi="Microsoft YaHei" w:eastAsia="Microsoft YaHei" w:cs="Microsoft YaHei"/>
+          <w:sz w:val="20"/>
+          <w:szCs w:val="20"/>
+          <w:lang w:val="en-US"/>
+        </w:rPr>
+        <w:t>{%certificate_of_employment_base64}</w:t>
+      </w:r>
+    </w:p>
+    <w:p>
+      <w:pPr>
+        <w:tabs>
+          <w:tab w:val="left" w:pos="3048"/>
+        </w:tabs>
+        <w:rPr>
+          <w:rFonts w:hint="default" w:ascii="Microsoft YaHei" w:hAnsi="Microsoft YaHei" w:eastAsia="Microsoft YaHei" w:cs="Microsoft YaHei"/>
+          <w:sz w:val="20"/>
+          <w:szCs w:val="20"/>
+          <w:lang w:val="en-US"/>
+        </w:rPr>
+      </w:pPr>
+    </w:p>
+    <w:p>
+      <w:pPr>
+        <w:tabs>
+          <w:tab w:val="left" w:pos="3048"/>
+        </w:tabs>
+        <w:rPr>
+          <w:rFonts w:hint="default" w:ascii="Microsoft YaHei" w:hAnsi="Microsoft YaHei" w:eastAsia="Microsoft YaHei" w:cs="Microsoft YaHei"/>
+          <w:sz w:val="20"/>
+          <w:szCs w:val="20"/>
+          <w:lang w:val="en-US"/>
+        </w:rPr>
+      </w:pPr>
+      <w:r>
+        <w:rPr>
+          <w:rFonts w:hint="default" w:ascii="Microsoft YaHei" w:hAnsi="Microsoft YaHei" w:eastAsia="Microsoft YaHei" w:cs="Microsoft YaHei"/>
+          <w:sz w:val="20"/>
+          <w:szCs w:val="20"/>
+          <w:lang w:val="en-US"/>
+        </w:rPr>
+        <w:t>{#additional_documents_base64}</w:t>
+      </w:r>
+    </w:p>
+    <w:p>
+      <w:pPr>
+        <w:tabs>
+          <w:tab w:val="left" w:pos="3048"/>
+        </w:tabs>
+        <w:rPr>
+          <w:rFonts w:hint="default" w:ascii="Microsoft YaHei" w:hAnsi="Microsoft YaHei" w:eastAsia="Microsoft YaHei" w:cs="Microsoft YaHei"/>
+          <w:sz w:val="20"/>
+          <w:szCs w:val="20"/>
+          <w:lang w:val="en-US"/>
+        </w:rPr>
+      </w:pPr>
+      <w:r>
+        <w:rPr>
+          <w:rFonts w:hint="default" w:ascii="Microsoft YaHei" w:hAnsi="Microsoft YaHei" w:eastAsia="Microsoft YaHei" w:cs="Microsoft YaHei"/>
+          <w:sz w:val="20"/>
+          <w:szCs w:val="20"/>
+          <w:lang w:val="en-US"/>
+        </w:rPr>
+        <w:t>{%</w:t>
+      </w:r>
+      <w:bookmarkStart w:id="0" w:name="_GoBack"/>
+      <w:bookmarkEnd w:id="0"/>
+      <w:r>
+        <w:rPr>
+          <w:rFonts w:hint="default" w:ascii="Microsoft YaHei" w:hAnsi="Microsoft YaHei" w:eastAsia="Microsoft YaHei" w:cs="Microsoft YaHei"/>
+          <w:sz w:val="20"/>
+          <w:szCs w:val="20"/>
+          <w:lang w:val="en-US"/>
+        </w:rPr>
+        <w:t xml:space="preserve">.} </w:t>
+      </w:r>
+    </w:p>
+    <w:p>
+      <w:pPr>
+        <w:tabs>
+          <w:tab w:val="left" w:pos="3048"/>
+        </w:tabs>
+        <w:rPr>
+          <w:rFonts w:hint="default" w:ascii="Microsoft YaHei" w:hAnsi="Microsoft YaHei" w:eastAsia="Microsoft YaHei" w:cs="Microsoft YaHei"/>
+          <w:sz w:val="20"/>
+          <w:szCs w:val="20"/>
+          <w:lang w:val="en-US"/>
+        </w:rPr>
+      </w:pPr>
+      <w:r>
+        <w:rPr>
+          <w:rFonts w:hint="default" w:ascii="Microsoft YaHei" w:hAnsi="Microsoft YaHei" w:eastAsia="Microsoft YaHei" w:cs="Microsoft YaHei"/>
+          <w:sz w:val="20"/>
+          <w:szCs w:val="20"/>
+          <w:lang w:val="en-US"/>
+        </w:rPr>
+        <w:t>{/additional_documents_base64}</w:t>
+      </w:r>
     </w:p>
     <w:sectPr>
       <w:headerReference r:id="rId3" w:type="default"/>
@@ -8298,7 +7740,7 @@
     <w:name w:val="heading 1"/>
     <w:basedOn w:val="1"/>
     <w:next w:val="1"/>
-    <w:link w:val="14"/>
+    <w:link w:val="15"/>
     <w:qFormat/>
     <w:uiPriority w:val="9"/>
     <w:pPr>
@@ -8321,7 +7763,7 @@
     <w:name w:val="heading 2"/>
     <w:basedOn w:val="1"/>
     <w:next w:val="1"/>
-    <w:link w:val="15"/>
+    <w:link w:val="16"/>
     <w:qFormat/>
     <w:uiPriority w:val="9"/>
     <w:pPr>
@@ -8343,7 +7785,7 @@
     <w:name w:val="heading 3"/>
     <w:basedOn w:val="1"/>
     <w:next w:val="1"/>
-    <w:link w:val="16"/>
+    <w:link w:val="17"/>
     <w:qFormat/>
     <w:uiPriority w:val="9"/>
     <w:pPr>
@@ -8365,7 +7807,7 @@
     <w:name w:val="heading 4"/>
     <w:basedOn w:val="1"/>
     <w:next w:val="1"/>
-    <w:link w:val="17"/>
+    <w:link w:val="18"/>
     <w:qFormat/>
     <w:uiPriority w:val="9"/>
     <w:pPr>
@@ -8386,7 +7828,7 @@
     <w:name w:val="heading 5"/>
     <w:basedOn w:val="1"/>
     <w:next w:val="1"/>
-    <w:link w:val="18"/>
+    <w:link w:val="19"/>
     <w:qFormat/>
     <w:uiPriority w:val="9"/>
     <w:pPr>
@@ -8408,7 +7850,7 @@
     <w:name w:val="heading 6"/>
     <w:basedOn w:val="1"/>
     <w:next w:val="1"/>
-    <w:link w:val="19"/>
+    <w:link w:val="20"/>
     <w:qFormat/>
     <w:uiPriority w:val="9"/>
     <w:pPr>
@@ -8451,7 +7893,7 @@
   <w:style w:type="paragraph" w:styleId="10">
     <w:name w:val="footer"/>
     <w:basedOn w:val="1"/>
-    <w:link w:val="23"/>
+    <w:link w:val="24"/>
     <w:unhideWhenUsed/>
     <w:qFormat/>
     <w:uiPriority w:val="99"/>
@@ -8465,7 +7907,7 @@
   <w:style w:type="paragraph" w:styleId="11">
     <w:name w:val="header"/>
     <w:basedOn w:val="1"/>
-    <w:link w:val="22"/>
+    <w:link w:val="23"/>
     <w:unhideWhenUsed/>
     <w:qFormat/>
     <w:uiPriority w:val="99"/>
@@ -8489,7 +7931,41 @@
       <w:szCs w:val="20"/>
     </w:rPr>
   </w:style>
-  <w:style w:type="character" w:styleId="13">
+  <w:style w:type="paragraph" w:styleId="13">
+    <w:name w:val="HTML Preformatted"/>
+    <w:semiHidden/>
+    <w:unhideWhenUsed/>
+    <w:uiPriority w:val="99"/>
+    <w:pPr>
+      <w:tabs>
+        <w:tab w:val="left" w:pos="916"/>
+        <w:tab w:val="left" w:pos="1832"/>
+        <w:tab w:val="left" w:pos="2748"/>
+        <w:tab w:val="left" w:pos="3664"/>
+        <w:tab w:val="left" w:pos="4580"/>
+        <w:tab w:val="left" w:pos="5496"/>
+        <w:tab w:val="left" w:pos="6412"/>
+        <w:tab w:val="left" w:pos="7328"/>
+        <w:tab w:val="left" w:pos="8244"/>
+        <w:tab w:val="left" w:pos="9160"/>
+        <w:tab w:val="left" w:pos="10076"/>
+        <w:tab w:val="left" w:pos="10992"/>
+        <w:tab w:val="left" w:pos="11908"/>
+        <w:tab w:val="left" w:pos="12824"/>
+        <w:tab w:val="left" w:pos="13740"/>
+        <w:tab w:val="left" w:pos="14656"/>
+      </w:tabs>
+      <w:jc w:val="left"/>
+    </w:pPr>
+    <w:rPr>
+      <w:rFonts w:hint="eastAsia" w:ascii="SimSun" w:hAnsi="SimSun" w:eastAsia="SimSun" w:cs="SimSun"/>
+      <w:kern w:val="0"/>
+      <w:sz w:val="24"/>
+      <w:szCs w:val="24"/>
+      <w:lang w:val="en-US" w:eastAsia="zh-CN" w:bidi="ar"/>
+    </w:rPr>
+  </w:style>
+  <w:style w:type="character" w:styleId="14">
     <w:name w:val="Hyperlink"/>
     <w:basedOn w:val="8"/>
     <w:unhideWhenUsed/>
@@ -8505,7 +7981,7 @@
       </w14:textFill>
     </w:rPr>
   </w:style>
-  <w:style w:type="character" w:customStyle="1" w:styleId="14">
+  <w:style w:type="character" w:customStyle="1" w:styleId="15">
     <w:name w:val="Heading 1 Char"/>
     <w:basedOn w:val="8"/>
     <w:link w:val="2"/>
@@ -8518,7 +7994,7 @@
       <w:szCs w:val="32"/>
     </w:rPr>
   </w:style>
-  <w:style w:type="character" w:customStyle="1" w:styleId="15">
+  <w:style w:type="character" w:customStyle="1" w:styleId="16">
     <w:name w:val="Heading 2 Char"/>
     <w:basedOn w:val="8"/>
     <w:link w:val="3"/>
@@ -8531,7 +8007,7 @@
       <w:szCs w:val="26"/>
     </w:rPr>
   </w:style>
-  <w:style w:type="character" w:customStyle="1" w:styleId="16">
+  <w:style w:type="character" w:customStyle="1" w:styleId="17">
     <w:name w:val="Heading 3 Char"/>
     <w:basedOn w:val="8"/>
     <w:link w:val="4"/>
@@ -8544,7 +8020,7 @@
       <w:szCs w:val="24"/>
     </w:rPr>
   </w:style>
-  <w:style w:type="character" w:customStyle="1" w:styleId="17">
+  <w:style w:type="character" w:customStyle="1" w:styleId="18">
     <w:name w:val="Heading 4 Char"/>
     <w:basedOn w:val="8"/>
     <w:link w:val="5"/>
@@ -8557,7 +8033,7 @@
       <w:color w:val="2F5496"/>
     </w:rPr>
   </w:style>
-  <w:style w:type="character" w:customStyle="1" w:styleId="18">
+  <w:style w:type="character" w:customStyle="1" w:styleId="19">
     <w:name w:val="Heading 5 Char"/>
     <w:basedOn w:val="8"/>
     <w:link w:val="6"/>
@@ -8568,7 +8044,7 @@
       <w:color w:val="2F5496"/>
     </w:rPr>
   </w:style>
-  <w:style w:type="character" w:customStyle="1" w:styleId="19">
+  <w:style w:type="character" w:customStyle="1" w:styleId="20">
     <w:name w:val="Heading 6 Char"/>
     <w:basedOn w:val="8"/>
     <w:link w:val="7"/>
@@ -8579,7 +8055,7 @@
       <w:color w:val="1F3763"/>
     </w:rPr>
   </w:style>
-  <w:style w:type="paragraph" w:customStyle="1" w:styleId="20">
+  <w:style w:type="paragraph" w:customStyle="1" w:styleId="21">
     <w:name w:val="Table Paragraph"/>
     <w:basedOn w:val="1"/>
     <w:qFormat/>
@@ -8595,7 +8071,7 @@
       <w:szCs w:val="22"/>
     </w:rPr>
   </w:style>
-  <w:style w:type="character" w:customStyle="1" w:styleId="21">
+  <w:style w:type="character" w:customStyle="1" w:styleId="22">
     <w:name w:val="Unresolved Mention"/>
     <w:basedOn w:val="8"/>
     <w:semiHidden/>
@@ -8607,7 +8083,7 @@
       <w:shd w:val="clear" w:color="auto" w:fill="E1DFDD"/>
     </w:rPr>
   </w:style>
-  <w:style w:type="character" w:customStyle="1" w:styleId="22">
+  <w:style w:type="character" w:customStyle="1" w:styleId="23">
     <w:name w:val="Header Char"/>
     <w:basedOn w:val="8"/>
     <w:link w:val="11"/>
@@ -8618,7 +8094,7 @@
       <w:szCs w:val="24"/>
     </w:rPr>
   </w:style>
-  <w:style w:type="character" w:customStyle="1" w:styleId="23">
+  <w:style w:type="character" w:customStyle="1" w:styleId="24">
     <w:name w:val="Footer Char"/>
     <w:basedOn w:val="8"/>
     <w:link w:val="10"/>
@@ -8629,7 +8105,7 @@
       <w:szCs w:val="24"/>
     </w:rPr>
   </w:style>
-  <w:style w:type="paragraph" w:styleId="24">
+  <w:style w:type="paragraph" w:styleId="25">
     <w:name w:val="List Paragraph"/>
     <w:basedOn w:val="1"/>
     <w:qFormat/>

</xml_diff>

<commit_message>
fix: capitalize option labels in Select and CheckboxGroup components
</commit_message>
<xml_diff>
--- a/public/template/biodata_template.docx
+++ b/public/template/biodata_template.docx
@@ -2474,17 +2474,8 @@
               </w:rPr>
               <w:t>EMPLOYMENT RECORD 工作经历：</w:t>
             </w:r>
-            <w:r>
-              <w:rPr>
-                <w:rFonts w:hint="default" w:ascii="STXihei" w:hAnsi="STXihei" w:eastAsia="STXihei" w:cs="STXihei"/>
-                <w:b w:val="0"/>
-                <w:bCs w:val="0"/>
-                <w:sz w:val="22"/>
-                <w:szCs w:val="22"/>
-                <w:lang w:val="en-US"/>
-              </w:rPr>
-              <w:t>{employment_record}</w:t>
-            </w:r>
+            <w:bookmarkStart w:id="0" w:name="_GoBack"/>
+            <w:bookmarkEnd w:id="0"/>
           </w:p>
           <w:p>
             <w:pPr>
@@ -7176,18 +7167,7 @@
           <w:szCs w:val="20"/>
           <w:lang w:val="en-US"/>
         </w:rPr>
-        <w:t>{%</w:t>
-      </w:r>
-      <w:bookmarkStart w:id="0" w:name="_GoBack"/>
-      <w:bookmarkEnd w:id="0"/>
-      <w:r>
-        <w:rPr>
-          <w:rFonts w:hint="default" w:ascii="Microsoft YaHei" w:hAnsi="Microsoft YaHei" w:eastAsia="Microsoft YaHei" w:cs="Microsoft YaHei"/>
-          <w:sz w:val="20"/>
-          <w:szCs w:val="20"/>
-          <w:lang w:val="en-US"/>
-        </w:rPr>
-        <w:t xml:space="preserve">.} </w:t>
+        <w:t xml:space="preserve">{%.} </w:t>
       </w:r>
     </w:p>
     <w:p>
@@ -7574,7 +7554,7 @@
     <w:lsdException w:qFormat="1" w:uiPriority="99" w:name="HTML Code"/>
     <w:lsdException w:uiPriority="99" w:name="HTML Definition"/>
     <w:lsdException w:uiPriority="99" w:name="HTML Keyboard"/>
-    <w:lsdException w:uiPriority="99" w:name="HTML Preformatted"/>
+    <w:lsdException w:qFormat="1" w:uiPriority="99" w:name="HTML Preformatted"/>
     <w:lsdException w:uiPriority="99" w:name="HTML Sample"/>
     <w:lsdException w:uiPriority="99" w:name="HTML Typewriter"/>
     <w:lsdException w:uiPriority="99" w:name="HTML Variable"/>
@@ -7935,6 +7915,7 @@
     <w:name w:val="HTML Preformatted"/>
     <w:semiHidden/>
     <w:unhideWhenUsed/>
+    <w:qFormat/>
     <w:uiPriority w:val="99"/>
     <w:pPr>
       <w:tabs>

</xml_diff>

<commit_message>
fix: update biodata template to include units for height and weight
</commit_message>
<xml_diff>
--- a/public/template/biodata_template.docx
+++ b/public/template/biodata_template.docx
@@ -1539,21 +1539,22 @@
           <w:p>
             <w:pPr>
               <w:rPr>
-                <w:rFonts w:ascii="STXihei" w:hAnsi="STXihei" w:eastAsia="STXihei" w:cs="STXihei"/>
+                <w:rFonts w:hint="default" w:ascii="STXihei" w:hAnsi="STXihei" w:eastAsia="STXihei" w:cs="STXihei"/>
                 <w:b/>
                 <w:bCs/>
                 <w:sz w:val="10"/>
                 <w:szCs w:val="10"/>
-              </w:rPr>
-            </w:pPr>
-            <w:r>
-              <w:rPr>
-                <w:rFonts w:hint="default" w:ascii="STXihei" w:hAnsi="STXihei" w:eastAsia="STXihei" w:cs="STXihei"/>
-                <w:sz w:val="22"/>
-                <w:szCs w:val="22"/>
-                <w:lang w:val="en-US"/>
-              </w:rPr>
-              <w:t>{height}</w:t>
+                <w:lang w:val="en-US"/>
+              </w:rPr>
+            </w:pPr>
+            <w:r>
+              <w:rPr>
+                <w:rFonts w:hint="default" w:ascii="STXihei" w:hAnsi="STXihei" w:eastAsia="STXihei" w:cs="STXihei"/>
+                <w:sz w:val="22"/>
+                <w:szCs w:val="22"/>
+                <w:lang w:val="en-US"/>
+              </w:rPr>
+              <w:t>{height} cm</w:t>
             </w:r>
           </w:p>
           <w:p>
@@ -1591,8 +1592,10 @@
           <w:p>
             <w:pPr>
               <w:rPr>
-                <w:sz w:val="22"/>
-                <w:szCs w:val="22"/>
+                <w:rFonts w:hint="default"/>
+                <w:sz w:val="22"/>
+                <w:szCs w:val="22"/>
+                <w:lang w:val="en-US"/>
               </w:rPr>
             </w:pPr>
             <w:r>
@@ -1604,8 +1607,10 @@
                 <w:szCs w:val="22"/>
                 <w:lang w:val="en-US"/>
               </w:rPr>
-              <w:t>{weight}</w:t>
-            </w:r>
+              <w:t>{weight} kg</w:t>
+            </w:r>
+            <w:bookmarkStart w:id="0" w:name="_GoBack"/>
+            <w:bookmarkEnd w:id="0"/>
           </w:p>
         </w:tc>
         <w:tc>
@@ -2474,8 +2479,6 @@
               </w:rPr>
               <w:t>EMPLOYMENT RECORD 工作经历：</w:t>
             </w:r>
-            <w:bookmarkStart w:id="0" w:name="_GoBack"/>
-            <w:bookmarkEnd w:id="0"/>
           </w:p>
           <w:p>
             <w:pPr>

</xml_diff>

<commit_message>
ch: center the avatar position in docx
</commit_message>
<xml_diff>
--- a/public/template/biodata_template.docx
+++ b/public/template/biodata_template.docx
@@ -196,6 +196,7 @@
           </w:tcPr>
           <w:p>
             <w:pPr>
+              <w:jc w:val="center"/>
               <w:rPr>
                 <w:rFonts w:hint="default" w:ascii="STXihei" w:hAnsi="STXihei" w:eastAsia="STXihei" w:cs="STXihei"/>
                 <w:sz w:val="22"/>
@@ -212,6 +213,8 @@
               </w:rPr>
               <w:t>{%avatar}</w:t>
             </w:r>
+            <w:bookmarkStart w:id="0" w:name="_GoBack"/>
+            <w:bookmarkEnd w:id="0"/>
           </w:p>
         </w:tc>
       </w:tr>
@@ -1609,8 +1612,6 @@
               </w:rPr>
               <w:t>{weight} kg</w:t>
             </w:r>
-            <w:bookmarkStart w:id="0" w:name="_GoBack"/>
-            <w:bookmarkEnd w:id="0"/>
           </w:p>
         </w:tc>
         <w:tc>

</xml_diff>

<commit_message>
ft: added new template for shanghai
</commit_message>
<xml_diff>
--- a/public/template/biodata_template.docx
+++ b/public/template/biodata_template.docx
@@ -213,8 +213,6 @@
               </w:rPr>
               <w:t>{%avatar}</w:t>
             </w:r>
-            <w:bookmarkStart w:id="0" w:name="_GoBack"/>
-            <w:bookmarkEnd w:id="0"/>
           </w:p>
         </w:tc>
       </w:tr>
@@ -1143,6 +1141,8 @@
                 <w:szCs w:val="22"/>
               </w:rPr>
             </w:pPr>
+            <w:bookmarkStart w:id="0" w:name="_GoBack"/>
+            <w:bookmarkEnd w:id="0"/>
           </w:p>
           <w:p>
             <w:pPr>

</xml_diff>